<commit_message>
assigning arduino mac to plant id working, only minor changes remaining
</commit_message>
<xml_diff>
--- a/Szakdolgozat - Okos IoT Virágcserép.docx
+++ b/Szakdolgozat - Okos IoT Virágcserép.docx
@@ -7,12 +7,8 @@
       <w:sdtPr>
         <w:rPr>
           <w:rFonts w:ascii="Times New Roman" w:eastAsiaTheme="minorHAnsi" w:hAnsi="Times New Roman" w:cstheme="minorBidi"/>
-          <w:color w:val="auto"/>
-          <w:kern w:val="2"/>
           <w:sz w:val="24"/>
           <w:szCs w:val="22"/>
-          <w:lang w:val="hu-HU"/>
-          <w14:ligatures w14:val="standardContextual"/>
         </w:rPr>
         <w:id w:val="-1933885819"/>
         <w:docPartObj>
@@ -22,31 +18,20 @@
       </w:sdtPr>
       <w:sdtEndPr>
         <w:rPr>
-          <w:b/>
-          <w:bCs/>
+          <w:caps w:val="0"/>
           <w:noProof/>
         </w:rPr>
       </w:sdtEndPr>
       <w:sdtContent>
         <w:p>
           <w:pPr>
-            <w:pStyle w:val="Tartalomjegyzkcmsora"/>
-            <w:jc w:val="center"/>
-            <w:rPr>
-              <w:color w:val="auto"/>
-            </w:rPr>
+            <w:pStyle w:val="Cmsor1"/>
           </w:pPr>
           <w:proofErr w:type="spellStart"/>
           <w:r>
-            <w:rPr>
-              <w:color w:val="auto"/>
-            </w:rPr>
             <w:t>T</w:t>
           </w:r>
           <w:r>
-            <w:rPr>
-              <w:color w:val="auto"/>
-            </w:rPr>
             <w:t>artalomjegyzék</w:t>
           </w:r>
           <w:proofErr w:type="spellEnd"/>
@@ -73,7 +58,7 @@
           <w:r>
             <w:fldChar w:fldCharType="separate"/>
           </w:r>
-          <w:hyperlink w:anchor="_Toc216401407" w:history="1">
+          <w:hyperlink w:anchor="_Toc218266167" w:history="1">
             <w:r>
               <w:rPr>
                 <w:rStyle w:val="Hiperhivatkozs"/>
@@ -100,7 +85,7 @@
                 <w:noProof/>
                 <w:webHidden/>
               </w:rPr>
-              <w:instrText xml:space="preserve"> PAGEREF _Toc216401407 \h </w:instrText>
+              <w:instrText xml:space="preserve"> PAGEREF _Toc218266167 \h </w:instrText>
             </w:r>
             <w:r>
               <w:rPr>
@@ -144,7 +129,7 @@
               <w:lang w:eastAsia="hu-HU"/>
             </w:rPr>
           </w:pPr>
-          <w:hyperlink w:anchor="_Toc216401408" w:history="1">
+          <w:hyperlink w:anchor="_Toc218266168" w:history="1">
             <w:r>
               <w:rPr>
                 <w:rStyle w:val="Hiperhivatkozs"/>
@@ -171,7 +156,7 @@
                 <w:noProof/>
                 <w:webHidden/>
               </w:rPr>
-              <w:instrText xml:space="preserve"> PAGEREF _Toc216401408 \h </w:instrText>
+              <w:instrText xml:space="preserve"> PAGEREF _Toc218266168 \h </w:instrText>
             </w:r>
             <w:r>
               <w:rPr>
@@ -215,7 +200,7 @@
               <w:lang w:eastAsia="hu-HU"/>
             </w:rPr>
           </w:pPr>
-          <w:hyperlink w:anchor="_Toc216401409" w:history="1">
+          <w:hyperlink w:anchor="_Toc218266169" w:history="1">
             <w:r>
               <w:rPr>
                 <w:rStyle w:val="Hiperhivatkozs"/>
@@ -242,7 +227,7 @@
                 <w:noProof/>
                 <w:webHidden/>
               </w:rPr>
-              <w:instrText xml:space="preserve"> PAGEREF _Toc216401409 \h </w:instrText>
+              <w:instrText xml:space="preserve"> PAGEREF _Toc218266169 \h </w:instrText>
             </w:r>
             <w:r>
               <w:rPr>
@@ -286,7 +271,7 @@
               <w:lang w:eastAsia="hu-HU"/>
             </w:rPr>
           </w:pPr>
-          <w:hyperlink w:anchor="_Toc216401410" w:history="1">
+          <w:hyperlink w:anchor="_Toc218266170" w:history="1">
             <w:r>
               <w:rPr>
                 <w:rStyle w:val="Hiperhivatkozs"/>
@@ -313,7 +298,7 @@
                 <w:noProof/>
                 <w:webHidden/>
               </w:rPr>
-              <w:instrText xml:space="preserve"> PAGEREF _Toc216401410 \h </w:instrText>
+              <w:instrText xml:space="preserve"> PAGEREF _Toc218266170 \h </w:instrText>
             </w:r>
             <w:r>
               <w:rPr>
@@ -357,7 +342,7 @@
               <w:lang w:eastAsia="hu-HU"/>
             </w:rPr>
           </w:pPr>
-          <w:hyperlink w:anchor="_Toc216401411" w:history="1">
+          <w:hyperlink w:anchor="_Toc218266171" w:history="1">
             <w:r>
               <w:rPr>
                 <w:rStyle w:val="Hiperhivatkozs"/>
@@ -384,7 +369,7 @@
                 <w:noProof/>
                 <w:webHidden/>
               </w:rPr>
-              <w:instrText xml:space="preserve"> PAGEREF _Toc216401411 \h </w:instrText>
+              <w:instrText xml:space="preserve"> PAGEREF _Toc218266171 \h </w:instrText>
             </w:r>
             <w:r>
               <w:rPr>
@@ -428,7 +413,7 @@
               <w:lang w:eastAsia="hu-HU"/>
             </w:rPr>
           </w:pPr>
-          <w:hyperlink w:anchor="_Toc216401412" w:history="1">
+          <w:hyperlink w:anchor="_Toc218266172" w:history="1">
             <w:r>
               <w:rPr>
                 <w:rStyle w:val="Hiperhivatkozs"/>
@@ -455,7 +440,7 @@
                 <w:noProof/>
                 <w:webHidden/>
               </w:rPr>
-              <w:instrText xml:space="preserve"> PAGEREF _Toc216401412 \h </w:instrText>
+              <w:instrText xml:space="preserve"> PAGEREF _Toc218266172 \h </w:instrText>
             </w:r>
             <w:r>
               <w:rPr>
@@ -499,7 +484,7 @@
               <w:lang w:eastAsia="hu-HU"/>
             </w:rPr>
           </w:pPr>
-          <w:hyperlink w:anchor="_Toc216401413" w:history="1">
+          <w:hyperlink w:anchor="_Toc218266173" w:history="1">
             <w:r>
               <w:rPr>
                 <w:rStyle w:val="Hiperhivatkozs"/>
@@ -526,7 +511,7 @@
                 <w:noProof/>
                 <w:webHidden/>
               </w:rPr>
-              <w:instrText xml:space="preserve"> PAGEREF _Toc216401413 \h </w:instrText>
+              <w:instrText xml:space="preserve"> PAGEREF _Toc218266173 \h </w:instrText>
             </w:r>
             <w:r>
               <w:rPr>
@@ -570,13 +555,13 @@
               <w:lang w:eastAsia="hu-HU"/>
             </w:rPr>
           </w:pPr>
-          <w:hyperlink w:anchor="_Toc216401414" w:history="1">
+          <w:hyperlink w:anchor="_Toc218266174" w:history="1">
             <w:r>
               <w:rPr>
                 <w:rStyle w:val="Hiperhivatkozs"/>
                 <w:noProof/>
               </w:rPr>
-              <w:t>4. Szenzorok</w:t>
+              <w:t>4. Szenzorok és Mikrokontroller</w:t>
             </w:r>
             <w:r>
               <w:rPr>
@@ -597,7 +582,7 @@
                 <w:noProof/>
                 <w:webHidden/>
               </w:rPr>
-              <w:instrText xml:space="preserve"> PAGEREF _Toc216401414 \h </w:instrText>
+              <w:instrText xml:space="preserve"> PAGEREF _Toc218266174 \h </w:instrText>
             </w:r>
             <w:r>
               <w:rPr>
@@ -641,7 +626,7 @@
               <w:lang w:eastAsia="hu-HU"/>
             </w:rPr>
           </w:pPr>
-          <w:hyperlink w:anchor="_Toc216401415" w:history="1">
+          <w:hyperlink w:anchor="_Toc218266175" w:history="1">
             <w:r>
               <w:rPr>
                 <w:rStyle w:val="Hiperhivatkozs"/>
@@ -668,7 +653,7 @@
                 <w:noProof/>
                 <w:webHidden/>
               </w:rPr>
-              <w:instrText xml:space="preserve"> PAGEREF _Toc216401415 \h </w:instrText>
+              <w:instrText xml:space="preserve"> PAGEREF _Toc218266175 \h </w:instrText>
             </w:r>
             <w:r>
               <w:rPr>
@@ -712,7 +697,7 @@
               <w:lang w:eastAsia="hu-HU"/>
             </w:rPr>
           </w:pPr>
-          <w:hyperlink w:anchor="_Toc216401416" w:history="1">
+          <w:hyperlink w:anchor="_Toc218266176" w:history="1">
             <w:r>
               <w:rPr>
                 <w:rStyle w:val="Hiperhivatkozs"/>
@@ -739,7 +724,7 @@
                 <w:noProof/>
                 <w:webHidden/>
               </w:rPr>
-              <w:instrText xml:space="preserve"> PAGEREF _Toc216401416 \h </w:instrText>
+              <w:instrText xml:space="preserve"> PAGEREF _Toc218266176 \h </w:instrText>
             </w:r>
             <w:r>
               <w:rPr>
@@ -783,14 +768,13 @@
               <w:lang w:eastAsia="hu-HU"/>
             </w:rPr>
           </w:pPr>
-          <w:hyperlink w:anchor="_Toc216401417" w:history="1">
+          <w:hyperlink w:anchor="_Toc218266177" w:history="1">
             <w:r>
               <w:rPr>
                 <w:rStyle w:val="Hiperhivatkozs"/>
                 <w:noProof/>
-                <w:color w:val="345964" w:themeColor="hyperlink" w:themeShade="BF"/>
-              </w:rPr>
-              <w:t>4.3 Fényellenállás – DS5-5528-LDR</w:t>
+              </w:rPr>
+              <w:t>4.3 Környezeti fényérzékelő – BH1750FVI-I2C-WO</w:t>
             </w:r>
             <w:r>
               <w:rPr>
@@ -811,7 +795,7 @@
                 <w:noProof/>
                 <w:webHidden/>
               </w:rPr>
-              <w:instrText xml:space="preserve"> PAGEREF _Toc216401417 \h </w:instrText>
+              <w:instrText xml:space="preserve"> PAGEREF _Toc218266177 \h </w:instrText>
             </w:r>
             <w:r>
               <w:rPr>
@@ -855,13 +839,13 @@
               <w:lang w:eastAsia="hu-HU"/>
             </w:rPr>
           </w:pPr>
-          <w:hyperlink w:anchor="_Toc216401418" w:history="1">
+          <w:hyperlink w:anchor="_Toc218266178" w:history="1">
             <w:r>
               <w:rPr>
                 <w:rStyle w:val="Hiperhivatkozs"/>
                 <w:noProof/>
               </w:rPr>
-              <w:t>4.4 Környezeti fényérzékelő – BH1750FVI-I2C-WO</w:t>
+              <w:t>4.4 LCD kijelző – KC-1602-GB</w:t>
             </w:r>
             <w:r>
               <w:rPr>
@@ -882,7 +866,7 @@
                 <w:noProof/>
                 <w:webHidden/>
               </w:rPr>
-              <w:instrText xml:space="preserve"> PAGEREF _Toc216401418 \h </w:instrText>
+              <w:instrText xml:space="preserve"> PAGEREF _Toc218266178 \h </w:instrText>
             </w:r>
             <w:r>
               <w:rPr>
@@ -926,13 +910,13 @@
               <w:lang w:eastAsia="hu-HU"/>
             </w:rPr>
           </w:pPr>
-          <w:hyperlink w:anchor="_Toc216401419" w:history="1">
+          <w:hyperlink w:anchor="_Toc218266179" w:history="1">
             <w:r>
               <w:rPr>
                 <w:rStyle w:val="Hiperhivatkozs"/>
                 <w:noProof/>
               </w:rPr>
-              <w:t>4.5 LCD kijelző – KC-1602-GB</w:t>
+              <w:t>4.5 Mikrokontroller – Arduino Uno R4 WiFi</w:t>
             </w:r>
             <w:r>
               <w:rPr>
@@ -953,7 +937,7 @@
                 <w:noProof/>
                 <w:webHidden/>
               </w:rPr>
-              <w:instrText xml:space="preserve"> PAGEREF _Toc216401419 \h </w:instrText>
+              <w:instrText xml:space="preserve"> PAGEREF _Toc218266179 \h </w:instrText>
             </w:r>
             <w:r>
               <w:rPr>
@@ -997,13 +981,13 @@
               <w:lang w:eastAsia="hu-HU"/>
             </w:rPr>
           </w:pPr>
-          <w:hyperlink w:anchor="_Toc216401420" w:history="1">
+          <w:hyperlink w:anchor="_Toc218266180" w:history="1">
             <w:r>
               <w:rPr>
                 <w:rStyle w:val="Hiperhivatkozs"/>
                 <w:noProof/>
               </w:rPr>
-              <w:t>5. Megvalósítás</w:t>
+              <w:t>5. Adatbázis</w:t>
             </w:r>
             <w:r>
               <w:rPr>
@@ -1024,7 +1008,7 @@
                 <w:noProof/>
                 <w:webHidden/>
               </w:rPr>
-              <w:instrText xml:space="preserve"> PAGEREF _Toc216401420 \h </w:instrText>
+              <w:instrText xml:space="preserve"> PAGEREF _Toc218266180 \h </w:instrText>
             </w:r>
             <w:r>
               <w:rPr>
@@ -1068,13 +1052,13 @@
               <w:lang w:eastAsia="hu-HU"/>
             </w:rPr>
           </w:pPr>
-          <w:hyperlink w:anchor="_Toc216401421" w:history="1">
+          <w:hyperlink w:anchor="_Toc218266181" w:history="1">
             <w:r>
               <w:rPr>
                 <w:rStyle w:val="Hiperhivatkozs"/>
                 <w:noProof/>
               </w:rPr>
-              <w:t>5.1 Szenzorok összekötése Arduinoval</w:t>
+              <w:t>5.1 A plants_data tábla</w:t>
             </w:r>
             <w:r>
               <w:rPr>
@@ -1095,7 +1079,7 @@
                 <w:noProof/>
                 <w:webHidden/>
               </w:rPr>
-              <w:instrText xml:space="preserve"> PAGEREF _Toc216401421 \h </w:instrText>
+              <w:instrText xml:space="preserve"> PAGEREF _Toc218266181 \h </w:instrText>
             </w:r>
             <w:r>
               <w:rPr>
@@ -1116,6 +1100,219 @@
                 <w:webHidden/>
               </w:rPr>
               <w:t>8</w:t>
+            </w:r>
+            <w:r>
+              <w:rPr>
+                <w:noProof/>
+                <w:webHidden/>
+              </w:rPr>
+              <w:fldChar w:fldCharType="end"/>
+            </w:r>
+          </w:hyperlink>
+        </w:p>
+        <w:p>
+          <w:pPr>
+            <w:pStyle w:val="TJ2"/>
+            <w:tabs>
+              <w:tab w:val="right" w:leader="dot" w:pos="8493"/>
+            </w:tabs>
+            <w:rPr>
+              <w:rFonts w:asciiTheme="minorHAnsi" w:eastAsiaTheme="minorEastAsia" w:hAnsiTheme="minorHAnsi"/>
+              <w:noProof/>
+              <w:szCs w:val="24"/>
+              <w:lang w:eastAsia="hu-HU"/>
+            </w:rPr>
+          </w:pPr>
+          <w:hyperlink w:anchor="_Toc218266182" w:history="1">
+            <w:r>
+              <w:rPr>
+                <w:rStyle w:val="Hiperhivatkozs"/>
+                <w:noProof/>
+              </w:rPr>
+              <w:t>5.2 A users tábla</w:t>
+            </w:r>
+            <w:r>
+              <w:rPr>
+                <w:noProof/>
+                <w:webHidden/>
+              </w:rPr>
+              <w:tab/>
+            </w:r>
+            <w:r>
+              <w:rPr>
+                <w:noProof/>
+                <w:webHidden/>
+              </w:rPr>
+              <w:fldChar w:fldCharType="begin"/>
+            </w:r>
+            <w:r>
+              <w:rPr>
+                <w:noProof/>
+                <w:webHidden/>
+              </w:rPr>
+              <w:instrText xml:space="preserve"> PAGEREF _Toc218266182 \h </w:instrText>
+            </w:r>
+            <w:r>
+              <w:rPr>
+                <w:noProof/>
+                <w:webHidden/>
+              </w:rPr>
+            </w:r>
+            <w:r>
+              <w:rPr>
+                <w:noProof/>
+                <w:webHidden/>
+              </w:rPr>
+              <w:fldChar w:fldCharType="separate"/>
+            </w:r>
+            <w:r>
+              <w:rPr>
+                <w:noProof/>
+                <w:webHidden/>
+              </w:rPr>
+              <w:t>9</w:t>
+            </w:r>
+            <w:r>
+              <w:rPr>
+                <w:noProof/>
+                <w:webHidden/>
+              </w:rPr>
+              <w:fldChar w:fldCharType="end"/>
+            </w:r>
+          </w:hyperlink>
+        </w:p>
+        <w:p>
+          <w:pPr>
+            <w:pStyle w:val="TJ2"/>
+            <w:tabs>
+              <w:tab w:val="right" w:leader="dot" w:pos="8493"/>
+            </w:tabs>
+            <w:rPr>
+              <w:rFonts w:asciiTheme="minorHAnsi" w:eastAsiaTheme="minorEastAsia" w:hAnsiTheme="minorHAnsi"/>
+              <w:noProof/>
+              <w:szCs w:val="24"/>
+              <w:lang w:eastAsia="hu-HU"/>
+            </w:rPr>
+          </w:pPr>
+          <w:hyperlink w:anchor="_Toc218266183" w:history="1">
+            <w:r>
+              <w:rPr>
+                <w:rStyle w:val="Hiperhivatkozs"/>
+                <w:noProof/>
+              </w:rPr>
+              <w:t>5.3 A current_plants</w:t>
+            </w:r>
+            <w:r>
+              <w:rPr>
+                <w:noProof/>
+                <w:webHidden/>
+              </w:rPr>
+              <w:tab/>
+            </w:r>
+            <w:r>
+              <w:rPr>
+                <w:noProof/>
+                <w:webHidden/>
+              </w:rPr>
+              <w:fldChar w:fldCharType="begin"/>
+            </w:r>
+            <w:r>
+              <w:rPr>
+                <w:noProof/>
+                <w:webHidden/>
+              </w:rPr>
+              <w:instrText xml:space="preserve"> PAGEREF _Toc218266183 \h </w:instrText>
+            </w:r>
+            <w:r>
+              <w:rPr>
+                <w:noProof/>
+                <w:webHidden/>
+              </w:rPr>
+            </w:r>
+            <w:r>
+              <w:rPr>
+                <w:noProof/>
+                <w:webHidden/>
+              </w:rPr>
+              <w:fldChar w:fldCharType="separate"/>
+            </w:r>
+            <w:r>
+              <w:rPr>
+                <w:noProof/>
+                <w:webHidden/>
+              </w:rPr>
+              <w:t>9</w:t>
+            </w:r>
+            <w:r>
+              <w:rPr>
+                <w:noProof/>
+                <w:webHidden/>
+              </w:rPr>
+              <w:fldChar w:fldCharType="end"/>
+            </w:r>
+          </w:hyperlink>
+        </w:p>
+        <w:p>
+          <w:pPr>
+            <w:pStyle w:val="TJ2"/>
+            <w:tabs>
+              <w:tab w:val="right" w:leader="dot" w:pos="8493"/>
+            </w:tabs>
+            <w:rPr>
+              <w:rFonts w:asciiTheme="minorHAnsi" w:eastAsiaTheme="minorEastAsia" w:hAnsiTheme="minorHAnsi"/>
+              <w:noProof/>
+              <w:szCs w:val="24"/>
+              <w:lang w:eastAsia="hu-HU"/>
+            </w:rPr>
+          </w:pPr>
+          <w:hyperlink w:anchor="_Toc218266184" w:history="1">
+            <w:r>
+              <w:rPr>
+                <w:rStyle w:val="Hiperhivatkozs"/>
+                <w:noProof/>
+              </w:rPr>
+              <w:t>5.4 A weekly_data tábla</w:t>
+            </w:r>
+            <w:r>
+              <w:rPr>
+                <w:noProof/>
+                <w:webHidden/>
+              </w:rPr>
+              <w:tab/>
+            </w:r>
+            <w:r>
+              <w:rPr>
+                <w:noProof/>
+                <w:webHidden/>
+              </w:rPr>
+              <w:fldChar w:fldCharType="begin"/>
+            </w:r>
+            <w:r>
+              <w:rPr>
+                <w:noProof/>
+                <w:webHidden/>
+              </w:rPr>
+              <w:instrText xml:space="preserve"> PAGEREF _Toc218266184 \h </w:instrText>
+            </w:r>
+            <w:r>
+              <w:rPr>
+                <w:noProof/>
+                <w:webHidden/>
+              </w:rPr>
+            </w:r>
+            <w:r>
+              <w:rPr>
+                <w:noProof/>
+                <w:webHidden/>
+              </w:rPr>
+              <w:fldChar w:fldCharType="separate"/>
+            </w:r>
+            <w:r>
+              <w:rPr>
+                <w:noProof/>
+                <w:webHidden/>
+              </w:rPr>
+              <w:t>10</w:t>
             </w:r>
             <w:r>
               <w:rPr>
@@ -1139,7 +1336,7 @@
               <w:lang w:eastAsia="hu-HU"/>
             </w:rPr>
           </w:pPr>
-          <w:hyperlink w:anchor="_Toc216401422" w:history="1">
+          <w:hyperlink w:anchor="_Toc218266185" w:history="1">
             <w:r>
               <w:rPr>
                 <w:rStyle w:val="Hiperhivatkozs"/>
@@ -1166,7 +1363,7 @@
                 <w:noProof/>
                 <w:webHidden/>
               </w:rPr>
-              <w:instrText xml:space="preserve"> PAGEREF _Toc216401422 \h </w:instrText>
+              <w:instrText xml:space="preserve"> PAGEREF _Toc218266185 \h </w:instrText>
             </w:r>
             <w:r>
               <w:rPr>
@@ -1186,7 +1383,7 @@
                 <w:noProof/>
                 <w:webHidden/>
               </w:rPr>
-              <w:t>9</w:t>
+              <w:t>11</w:t>
             </w:r>
             <w:r>
               <w:rPr>
@@ -1216,7 +1413,7 @@
       <w:pPr>
         <w:pStyle w:val="Cmsor1"/>
       </w:pPr>
-      <w:bookmarkStart w:id="0" w:name="_Toc216401407"/>
+      <w:bookmarkStart w:id="0" w:name="_Toc218266167"/>
       <w:r>
         <w:lastRenderedPageBreak/>
         <w:t>1.</w:t>
@@ -1231,7 +1428,13 @@
         <w:t xml:space="preserve">Szakdolgozatom </w:t>
       </w:r>
       <w:r>
-        <w:t>témáját sajátmindennapjaim ihlették. Mint sok má</w:t>
+        <w:t>témáját saját</w:t>
+      </w:r>
+      <w:r>
+        <w:t xml:space="preserve"> </w:t>
+      </w:r>
+      <w:r>
+        <w:t>mindennapjaim ihlették. Mint sok má</w:t>
       </w:r>
       <w:r>
         <w:t xml:space="preserve">s ember, én is előszeretettel veszem körül </w:t>
@@ -1264,13 +1467,13 @@
         <w:t>életben</w:t>
       </w:r>
       <w:r>
+        <w:rPr>
+          <w:color w:val="FF0000"/>
+        </w:rPr>
         <w:t xml:space="preserve"> </w:t>
       </w:r>
       <w:r>
-        <w:rPr>
-          <w:color w:val="FF0000"/>
-        </w:rPr>
-        <w:t>zöld lakótársaimat</w:t>
+        <w:t>növényeimet</w:t>
       </w:r>
       <w:r>
         <w:t>?</w:t>
@@ -1281,7 +1484,7 @@
         <w:t xml:space="preserve">A szakdolgozatom elkészítésével kitűzött célom egy </w:t>
       </w:r>
       <w:r>
-        <w:t xml:space="preserve">egyszerű, de hatékony és letisztult okos virágcserép megvalósítása, melynek segítségével </w:t>
+        <w:t xml:space="preserve">hatékony és letisztult okos virágcserép megvalósítása, melynek segítségével </w:t>
       </w:r>
       <w:r>
         <w:t>mérhetővé válnak a vizsgált növény létfontosság</w:t>
@@ -1317,7 +1520,13 @@
         <w:t>állapotát, ezáltal megkönnyítve a</w:t>
       </w:r>
       <w:r>
-        <w:t>z arról való gondolkodást olyanok számára is, akik egyáltalán nem jártasak a növény gondozásban</w:t>
+        <w:t>z arról való gondo</w:t>
+      </w:r>
+      <w:r>
+        <w:t>s</w:t>
+      </w:r>
+      <w:r>
+        <w:t>kodást olyanok számára is, akik egyáltalán nem jártasak a növény gondozásban</w:t>
       </w:r>
       <w:r>
         <w:t>.</w:t>
@@ -1426,7 +1635,21 @@
           <w:rFonts w:cs="Times New Roman"/>
           <w:szCs w:val="24"/>
         </w:rPr>
-        <w:t xml:space="preserve"> használatát. Ebben a szakdolgozatban </w:t>
+        <w:t xml:space="preserve"> használatát</w:t>
+      </w:r>
+      <w:r>
+        <w:rPr>
+          <w:rFonts w:cs="Times New Roman"/>
+          <w:szCs w:val="24"/>
+        </w:rPr>
+        <w:t>, illetve a mért paraméterek meghatározását</w:t>
+      </w:r>
+      <w:r>
+        <w:rPr>
+          <w:rFonts w:cs="Times New Roman"/>
+          <w:szCs w:val="24"/>
+        </w:rPr>
+        <w:t xml:space="preserve">. Ebben a szakdolgozatban </w:t>
       </w:r>
       <w:r>
         <w:rPr>
@@ -1461,7 +1684,7 @@
       <w:pPr>
         <w:pStyle w:val="Cmsor1"/>
       </w:pPr>
-      <w:bookmarkStart w:id="1" w:name="_Toc216401408"/>
+      <w:bookmarkStart w:id="1" w:name="_Toc218266168"/>
       <w:r>
         <w:lastRenderedPageBreak/>
         <w:t>2</w:t>
@@ -1482,7 +1705,7 @@
       <w:pPr>
         <w:pStyle w:val="Cmsor1"/>
       </w:pPr>
-      <w:bookmarkStart w:id="2" w:name="_Toc216401409"/>
+      <w:bookmarkStart w:id="2" w:name="_Toc218266169"/>
       <w:r>
         <w:lastRenderedPageBreak/>
         <w:t>3</w:t>
@@ -1539,7 +1762,7 @@
       <w:pPr>
         <w:pStyle w:val="Cmsor2"/>
       </w:pPr>
-      <w:bookmarkStart w:id="3" w:name="_Toc216401410"/>
+      <w:bookmarkStart w:id="3" w:name="_Toc218266170"/>
       <w:r>
         <w:t>3</w:t>
       </w:r>
@@ -1594,70 +1817,38 @@
           <w:rFonts w:cs="Times New Roman"/>
           <w:szCs w:val="24"/>
         </w:rPr>
-        <w:t>növények zölt színéért felelős, ezért elsárgulhatnak. Leeshetnek a leveleik és elfőfordulhat, hogy virágot sem hoznak. Ezzel ellentétben a túl sok vagy túl intenzív napfény érte növények levelei kifakulhatnak vagy akár meg is perzselődhetnek.</w:t>
-      </w:r>
-      <w:sdt>
-        <w:sdtPr>
-          <w:rPr>
-            <w:rFonts w:cs="Times New Roman"/>
-            <w:szCs w:val="24"/>
-          </w:rPr>
-          <w:id w:val="2026133385"/>
-          <w:citation/>
-        </w:sdtPr>
-        <w:sdtContent>
-          <w:r>
-            <w:rPr>
-              <w:rFonts w:cs="Times New Roman"/>
-              <w:szCs w:val="24"/>
-            </w:rPr>
-            <w:fldChar w:fldCharType="begin"/>
-          </w:r>
-          <w:r>
-            <w:rPr>
-              <w:rFonts w:cs="Times New Roman"/>
-              <w:szCs w:val="24"/>
-            </w:rPr>
-            <w:instrText xml:space="preserve">CITATION 1 \l 1038 </w:instrText>
-          </w:r>
-          <w:r>
-            <w:rPr>
-              <w:rFonts w:cs="Times New Roman"/>
-              <w:szCs w:val="24"/>
-            </w:rPr>
-            <w:fldChar w:fldCharType="separate"/>
-          </w:r>
-          <w:r>
-            <w:rPr>
-              <w:rFonts w:cs="Times New Roman"/>
-              <w:noProof/>
-              <w:szCs w:val="24"/>
-            </w:rPr>
-            <w:t xml:space="preserve"> </w:t>
-          </w:r>
-          <w:r>
-            <w:rPr>
-              <w:rFonts w:cs="Times New Roman"/>
-              <w:noProof/>
-              <w:szCs w:val="24"/>
-            </w:rPr>
-            <w:t>(Weisenhorn &amp; Hoidal, 2024)</w:t>
-          </w:r>
-          <w:r>
-            <w:rPr>
-              <w:rFonts w:cs="Times New Roman"/>
-              <w:szCs w:val="24"/>
-            </w:rPr>
-            <w:fldChar w:fldCharType="end"/>
-          </w:r>
-        </w:sdtContent>
-      </w:sdt>
+        <w:t xml:space="preserve">növények zölt színéért felelős, ezért elsárgulhatnak. Leeshetnek a leveleik és elfőfordulhat, hogy virágot sem hoznak. Ezzel ellentétben a túl sok vagy túl intenzív napfény érte növények levelei </w:t>
+      </w:r>
+      <w:proofErr w:type="gramStart"/>
+      <w:r>
+        <w:rPr>
+          <w:rFonts w:cs="Times New Roman"/>
+          <w:szCs w:val="24"/>
+        </w:rPr>
+        <w:t>kifakulhatnak</w:t>
+      </w:r>
+      <w:proofErr w:type="gramEnd"/>
+      <w:r>
+        <w:rPr>
+          <w:rFonts w:cs="Times New Roman"/>
+          <w:szCs w:val="24"/>
+        </w:rPr>
+        <w:t xml:space="preserve"> vagy akár meg is perzselődhetnek.</w:t>
+      </w:r>
+      <w:r>
+        <w:rPr>
+          <w:rStyle w:val="Lbjegyzet-hivatkozs"/>
+          <w:rFonts w:cs="Times New Roman"/>
+          <w:szCs w:val="24"/>
+        </w:rPr>
+        <w:footnoteReference w:id="1"/>
+      </w:r>
     </w:p>
     <w:p>
       <w:pPr>
         <w:pStyle w:val="Cmsor2"/>
       </w:pPr>
-      <w:bookmarkStart w:id="4" w:name="_Toc216401411"/>
+      <w:bookmarkStart w:id="4" w:name="_Toc218266171"/>
       <w:r>
         <w:t xml:space="preserve">3.2 </w:t>
       </w:r>
@@ -1849,124 +2040,20 @@
         </w:rPr>
         <w:t>nyt víz felvételére.</w:t>
       </w:r>
-      <w:sdt>
-        <w:sdtPr>
-          <w:rPr>
-            <w:rFonts w:cs="Times New Roman"/>
-            <w:szCs w:val="24"/>
-          </w:rPr>
-          <w:id w:val="1180465604"/>
-          <w:citation/>
-        </w:sdtPr>
-        <w:sdtContent>
-          <w:r>
-            <w:rPr>
-              <w:rFonts w:cs="Times New Roman"/>
-              <w:szCs w:val="24"/>
-            </w:rPr>
-            <w:fldChar w:fldCharType="begin"/>
-          </w:r>
-          <w:r>
-            <w:rPr>
-              <w:rFonts w:cs="Times New Roman"/>
-              <w:szCs w:val="24"/>
-            </w:rPr>
-            <w:instrText xml:space="preserve">CITATION 2 \l 1038 </w:instrText>
-          </w:r>
-          <w:r>
-            <w:rPr>
-              <w:rFonts w:cs="Times New Roman"/>
-              <w:szCs w:val="24"/>
-            </w:rPr>
-            <w:fldChar w:fldCharType="separate"/>
-          </w:r>
-          <w:r>
-            <w:rPr>
-              <w:rFonts w:cs="Times New Roman"/>
-              <w:noProof/>
-              <w:szCs w:val="24"/>
-            </w:rPr>
-            <w:t xml:space="preserve"> </w:t>
-          </w:r>
-          <w:r>
-            <w:rPr>
-              <w:rFonts w:cs="Times New Roman"/>
-              <w:noProof/>
-              <w:szCs w:val="24"/>
-            </w:rPr>
-            <w:t>(Richmond, 2021)</w:t>
-          </w:r>
-          <w:r>
-            <w:rPr>
-              <w:rFonts w:cs="Times New Roman"/>
-              <w:szCs w:val="24"/>
-            </w:rPr>
-            <w:fldChar w:fldCharType="end"/>
-          </w:r>
-        </w:sdtContent>
-      </w:sdt>
-      <w:sdt>
-        <w:sdtPr>
-          <w:rPr>
-            <w:rFonts w:cs="Times New Roman"/>
-            <w:szCs w:val="24"/>
-          </w:rPr>
-          <w:id w:val="-139497519"/>
-          <w:citation/>
-        </w:sdtPr>
-        <w:sdtContent>
-          <w:r>
-            <w:rPr>
-              <w:rFonts w:cs="Times New Roman"/>
-              <w:szCs w:val="24"/>
-            </w:rPr>
-            <w:fldChar w:fldCharType="begin"/>
-          </w:r>
-          <w:r>
-            <w:rPr>
-              <w:rFonts w:cs="Times New Roman"/>
-              <w:szCs w:val="24"/>
-            </w:rPr>
-            <w:instrText xml:space="preserve">CITATION 3 \l 1038 </w:instrText>
-          </w:r>
-          <w:r>
-            <w:rPr>
-              <w:rFonts w:cs="Times New Roman"/>
-              <w:szCs w:val="24"/>
-            </w:rPr>
-            <w:fldChar w:fldCharType="separate"/>
-          </w:r>
-          <w:r>
-            <w:rPr>
-              <w:rFonts w:cs="Times New Roman"/>
-              <w:noProof/>
-              <w:szCs w:val="24"/>
-            </w:rPr>
-            <w:t xml:space="preserve"> </w:t>
-          </w:r>
-          <w:r>
-            <w:rPr>
-              <w:rFonts w:cs="Times New Roman"/>
-              <w:noProof/>
-              <w:szCs w:val="24"/>
-            </w:rPr>
-            <w:t>(Clement &amp; Malinoski, 2023)</w:t>
-          </w:r>
-          <w:r>
-            <w:rPr>
-              <w:rFonts w:cs="Times New Roman"/>
-              <w:szCs w:val="24"/>
-            </w:rPr>
-            <w:fldChar w:fldCharType="end"/>
-          </w:r>
-        </w:sdtContent>
-      </w:sdt>
+      <w:r>
+        <w:rPr>
+          <w:rStyle w:val="Lbjegyzet-hivatkozs"/>
+          <w:rFonts w:cs="Times New Roman"/>
+          <w:szCs w:val="24"/>
+        </w:rPr>
+        <w:footnoteReference w:id="2"/>
+      </w:r>
     </w:p>
     <w:p>
       <w:pPr>
         <w:pStyle w:val="Cmsor2"/>
       </w:pPr>
-      <w:bookmarkStart w:id="5" w:name="_Toc216401412"/>
+      <w:bookmarkStart w:id="5" w:name="_Toc218266172"/>
       <w:r>
         <w:t xml:space="preserve">3.3 </w:t>
       </w:r>
@@ -2059,68 +2146,20 @@
         </w:rPr>
         <w:t>befolyásolhatja negatívan (például kevesebb gyümölcsöt hoz).</w:t>
       </w:r>
-      <w:sdt>
-        <w:sdtPr>
-          <w:rPr>
-            <w:rFonts w:cs="Times New Roman"/>
-            <w:szCs w:val="24"/>
-          </w:rPr>
-          <w:id w:val="898635304"/>
-          <w:citation/>
-        </w:sdtPr>
-        <w:sdtContent>
-          <w:r>
-            <w:rPr>
-              <w:rFonts w:cs="Times New Roman"/>
-              <w:szCs w:val="24"/>
-            </w:rPr>
-            <w:fldChar w:fldCharType="begin"/>
-          </w:r>
-          <w:r>
-            <w:rPr>
-              <w:rFonts w:cs="Times New Roman"/>
-              <w:szCs w:val="24"/>
-            </w:rPr>
-            <w:instrText xml:space="preserve"> CITATION Van24 \l 1038 </w:instrText>
-          </w:r>
-          <w:r>
-            <w:rPr>
-              <w:rFonts w:cs="Times New Roman"/>
-              <w:szCs w:val="24"/>
-            </w:rPr>
-            <w:fldChar w:fldCharType="separate"/>
-          </w:r>
-          <w:r>
-            <w:rPr>
-              <w:rFonts w:cs="Times New Roman"/>
-              <w:noProof/>
-              <w:szCs w:val="24"/>
-            </w:rPr>
-            <w:t xml:space="preserve"> </w:t>
-          </w:r>
-          <w:r>
-            <w:rPr>
-              <w:rFonts w:cs="Times New Roman"/>
-              <w:noProof/>
-              <w:szCs w:val="24"/>
-            </w:rPr>
-            <w:t>(VanDerZanden, 2024)</w:t>
-          </w:r>
-          <w:r>
-            <w:rPr>
-              <w:rFonts w:cs="Times New Roman"/>
-              <w:szCs w:val="24"/>
-            </w:rPr>
-            <w:fldChar w:fldCharType="end"/>
-          </w:r>
-        </w:sdtContent>
-      </w:sdt>
+      <w:r>
+        <w:rPr>
+          <w:rStyle w:val="Lbjegyzet-hivatkozs"/>
+          <w:rFonts w:cs="Times New Roman"/>
+          <w:szCs w:val="24"/>
+        </w:rPr>
+        <w:footnoteReference w:id="3"/>
+      </w:r>
     </w:p>
     <w:p>
       <w:pPr>
         <w:pStyle w:val="Cmsor2"/>
       </w:pPr>
-      <w:bookmarkStart w:id="6" w:name="_Toc216401413"/>
+      <w:bookmarkStart w:id="6" w:name="_Toc218266173"/>
       <w:r>
         <w:t xml:space="preserve">3.4 </w:t>
       </w:r>
@@ -2164,74 +2203,29 @@
         </w:rPr>
         <w:t xml:space="preserve"> is, ami hosszú távon a növény elrohadásához vezethet. Az alacsony relatív páratartalom és meleg hőmérséklet együttese növeli a párologtatás mértékét, emiatt a növénynek több vízre és tápanyagra van szüksége.</w:t>
       </w:r>
-      <w:sdt>
-        <w:sdtPr>
-          <w:rPr>
-            <w:rFonts w:cs="Times New Roman"/>
-            <w:szCs w:val="24"/>
-          </w:rPr>
-          <w:id w:val="1438649826"/>
-          <w:citation/>
-        </w:sdtPr>
-        <w:sdtContent>
-          <w:r>
-            <w:rPr>
-              <w:rFonts w:cs="Times New Roman"/>
-              <w:szCs w:val="24"/>
-            </w:rPr>
-            <w:fldChar w:fldCharType="begin"/>
-          </w:r>
-          <w:r>
-            <w:rPr>
-              <w:rFonts w:cs="Times New Roman"/>
-              <w:szCs w:val="24"/>
-            </w:rPr>
-            <w:instrText xml:space="preserve">CITATION Blo \y  \l 1038 </w:instrText>
-          </w:r>
-          <w:r>
-            <w:rPr>
-              <w:rFonts w:cs="Times New Roman"/>
-              <w:szCs w:val="24"/>
-            </w:rPr>
-            <w:fldChar w:fldCharType="separate"/>
-          </w:r>
-          <w:r>
-            <w:rPr>
-              <w:rFonts w:cs="Times New Roman"/>
-              <w:noProof/>
-              <w:szCs w:val="24"/>
-            </w:rPr>
-            <w:t xml:space="preserve"> </w:t>
-          </w:r>
-          <w:r>
-            <w:rPr>
-              <w:rFonts w:cs="Times New Roman"/>
-              <w:noProof/>
-              <w:szCs w:val="24"/>
-            </w:rPr>
-            <w:t>(Polygon – Blog – Temporary Climate Solutions)</w:t>
-          </w:r>
-          <w:r>
-            <w:rPr>
-              <w:rFonts w:cs="Times New Roman"/>
-              <w:szCs w:val="24"/>
-            </w:rPr>
-            <w:fldChar w:fldCharType="end"/>
-          </w:r>
-        </w:sdtContent>
-      </w:sdt>
+      <w:r>
+        <w:rPr>
+          <w:rStyle w:val="Lbjegyzet-hivatkozs"/>
+          <w:rFonts w:cs="Times New Roman"/>
+          <w:szCs w:val="24"/>
+        </w:rPr>
+        <w:footnoteReference w:id="4"/>
+      </w:r>
     </w:p>
     <w:p>
       <w:pPr>
         <w:pStyle w:val="Cmsor1"/>
       </w:pPr>
-      <w:bookmarkStart w:id="7" w:name="_Toc216401414"/>
+      <w:bookmarkStart w:id="7" w:name="_Toc218266174"/>
       <w:r>
         <w:lastRenderedPageBreak/>
         <w:t xml:space="preserve">4. </w:t>
       </w:r>
       <w:r>
         <w:t>Szenzorok</w:t>
+      </w:r>
+      <w:r>
+        <w:t xml:space="preserve"> és Mikrokontroller</w:t>
       </w:r>
       <w:bookmarkEnd w:id="7"/>
     </w:p>
@@ -2304,7 +2298,7 @@
       <w:pPr>
         <w:pStyle w:val="Cmsor2"/>
       </w:pPr>
-      <w:bookmarkStart w:id="8" w:name="_Toc216401415"/>
+      <w:bookmarkStart w:id="8" w:name="_Toc218266175"/>
       <w:r>
         <w:t xml:space="preserve">4.1 </w:t>
       </w:r>
@@ -2696,7 +2690,7 @@
       <w:pPr>
         <w:pStyle w:val="Cmsor2"/>
       </w:pPr>
-      <w:bookmarkStart w:id="9" w:name="_Toc216401416"/>
+      <w:bookmarkStart w:id="9" w:name="_Toc218266176"/>
       <w:r>
         <w:t xml:space="preserve">4.2 </w:t>
       </w:r>
@@ -3031,35 +3025,35 @@
     <w:p>
       <w:pPr>
         <w:pStyle w:val="Cmsor2"/>
-        <w:rPr>
-          <w:color w:val="BFBFBF" w:themeColor="background1" w:themeShade="BF"/>
-        </w:rPr>
       </w:pPr>
-      <w:bookmarkStart w:id="10" w:name="_Toc216401417"/>
-      <w:r>
-        <w:rPr>
-          <w:color w:val="BFBFBF" w:themeColor="background1" w:themeShade="BF"/>
-        </w:rPr>
+      <w:bookmarkStart w:id="10" w:name="_Toc218266177"/>
+      <w:r>
         <w:lastRenderedPageBreak/>
-        <w:t xml:space="preserve">4.3 </w:t>
-      </w:r>
-      <w:r>
-        <w:rPr>
-          <w:color w:val="BFBFBF" w:themeColor="background1" w:themeShade="BF"/>
-        </w:rPr>
-        <w:t>Fény</w:t>
-      </w:r>
-      <w:r>
-        <w:rPr>
-          <w:color w:val="BFBFBF" w:themeColor="background1" w:themeShade="BF"/>
-        </w:rPr>
-        <w:t>ellenállás – DS5-</w:t>
-      </w:r>
-      <w:r>
-        <w:rPr>
-          <w:color w:val="BFBFBF" w:themeColor="background1" w:themeShade="BF"/>
-        </w:rPr>
-        <w:t>5528-LDR</w:t>
+        <w:t>4.</w:t>
+      </w:r>
+      <w:r>
+        <w:t>3</w:t>
+      </w:r>
+      <w:r>
+        <w:t xml:space="preserve"> </w:t>
+      </w:r>
+      <w:r>
+        <w:t xml:space="preserve">Környezeti fényérzékelő </w:t>
+      </w:r>
+      <w:r>
+        <w:t>–</w:t>
+      </w:r>
+      <w:r>
+        <w:t xml:space="preserve"> </w:t>
+      </w:r>
+      <w:r>
+        <w:t>BH1750FVI</w:t>
+      </w:r>
+      <w:r>
+        <w:t>-I2C-W</w:t>
+      </w:r>
+      <w:r>
+        <w:t>O</w:t>
       </w:r>
       <w:bookmarkEnd w:id="10"/>
     </w:p>
@@ -3067,134 +3061,65 @@
       <w:pPr>
         <w:rPr>
           <w:rFonts w:cs="Times New Roman"/>
-          <w:color w:val="BFBFBF" w:themeColor="background1" w:themeShade="BF"/>
           <w:szCs w:val="24"/>
         </w:rPr>
       </w:pPr>
       <w:r>
         <w:rPr>
           <w:rFonts w:cs="Times New Roman"/>
-          <w:color w:val="BFBFBF" w:themeColor="background1" w:themeShade="BF"/>
-          <w:szCs w:val="24"/>
-        </w:rPr>
-        <w:t xml:space="preserve">Erre a kis egyszerű fényellenállásra azért van szükség, hogy megnézhessük egy nap alatt hány </w:t>
-      </w:r>
-      <w:r>
-        <w:rPr>
-          <w:rFonts w:cs="Times New Roman"/>
-          <w:color w:val="BFBFBF" w:themeColor="background1" w:themeShade="BF"/>
-          <w:szCs w:val="24"/>
-        </w:rPr>
-        <w:t>órányi napsütés éri a növényt, tehát elég, ha azt tudjuk vele érzékelni, hogy a környetei fény</w:t>
-      </w:r>
-      <w:r>
-        <w:rPr>
-          <w:rFonts w:cs="Times New Roman"/>
-          <w:color w:val="BFBFBF" w:themeColor="background1" w:themeShade="BF"/>
-          <w:szCs w:val="24"/>
-        </w:rPr>
-        <w:t xml:space="preserve"> erőssége elért-e egy bizonyos (mérésekkel meghatározott) határértéket, és hogy a nap során mennyi ideig volt a fény erőssége efölött a határérték fölött</w:t>
-      </w:r>
-      <w:r>
-        <w:rPr>
-          <w:rFonts w:cs="Times New Roman"/>
-          <w:color w:val="BFBFBF" w:themeColor="background1" w:themeShade="BF"/>
+          <w:szCs w:val="24"/>
+        </w:rPr>
+        <w:t xml:space="preserve">A növények </w:t>
+      </w:r>
+      <w:r>
+        <w:rPr>
+          <w:rFonts w:cs="Times New Roman"/>
+          <w:szCs w:val="24"/>
+        </w:rPr>
+        <w:t xml:space="preserve">fényigényének intenzitása </w:t>
+      </w:r>
+      <w:r>
+        <w:rPr>
+          <w:rFonts w:cs="Times New Roman"/>
+          <w:szCs w:val="24"/>
+        </w:rPr>
+        <w:t xml:space="preserve">megközelítőleg 500 és </w:t>
+      </w:r>
+      <w:r>
+        <w:rPr>
+          <w:rFonts w:cs="Times New Roman"/>
+          <w:szCs w:val="24"/>
+        </w:rPr>
+        <w:t>2</w:t>
+      </w:r>
+      <w:r>
+        <w:rPr>
+          <w:rFonts w:cs="Times New Roman"/>
+          <w:szCs w:val="24"/>
+        </w:rPr>
+        <w:t xml:space="preserve">0.000 lux között mozog, ezért </w:t>
+      </w:r>
+      <w:r>
+        <w:rPr>
+          <w:rFonts w:cs="Times New Roman"/>
+          <w:szCs w:val="24"/>
+        </w:rPr>
+        <w:t xml:space="preserve">ez a fényérzékelő tökéletesen megfelel, hiszen 1-től egészen </w:t>
+      </w:r>
+      <w:r>
+        <w:rPr>
+          <w:rFonts w:cs="Times New Roman"/>
+          <w:szCs w:val="24"/>
+        </w:rPr>
+        <w:t>65</w:t>
+      </w:r>
+      <w:r>
+        <w:rPr>
+          <w:rFonts w:cs="Times New Roman"/>
           <w:szCs w:val="24"/>
         </w:rPr>
         <w:t>.</w:t>
       </w:r>
-    </w:p>
-    <w:p>
-      <w:pPr>
-        <w:pStyle w:val="Cmsor2"/>
-      </w:pPr>
-      <w:bookmarkStart w:id="11" w:name="_Toc216401418"/>
-      <w:r>
-        <w:t xml:space="preserve">4.4 </w:t>
-      </w:r>
-      <w:r>
-        <w:t xml:space="preserve">Környezeti fényérzékelő </w:t>
-      </w:r>
-      <w:r>
-        <w:t>–</w:t>
-      </w:r>
-      <w:r>
-        <w:t xml:space="preserve"> </w:t>
-      </w:r>
-      <w:r>
-        <w:t>BH1750FVI</w:t>
-      </w:r>
-      <w:r>
-        <w:t>-I2C-W</w:t>
-      </w:r>
-      <w:r>
-        <w:t>O</w:t>
-      </w:r>
-      <w:bookmarkEnd w:id="11"/>
-    </w:p>
-    <w:p>
-      <w:pPr>
-        <w:rPr>
-          <w:rFonts w:cs="Times New Roman"/>
-          <w:szCs w:val="24"/>
-        </w:rPr>
-      </w:pPr>
-      <w:r>
-        <w:rPr>
-          <w:rFonts w:cs="Times New Roman"/>
-          <w:szCs w:val="24"/>
-        </w:rPr>
-        <w:t xml:space="preserve">A növények </w:t>
-      </w:r>
-      <w:r>
-        <w:rPr>
-          <w:rFonts w:cs="Times New Roman"/>
-          <w:szCs w:val="24"/>
-        </w:rPr>
-        <w:t xml:space="preserve">fényigényének intenzitása </w:t>
-      </w:r>
-      <w:r>
-        <w:rPr>
-          <w:rFonts w:cs="Times New Roman"/>
-          <w:szCs w:val="24"/>
-        </w:rPr>
-        <w:t xml:space="preserve">megközelítőleg 500 és </w:t>
-      </w:r>
-      <w:r>
-        <w:rPr>
-          <w:rFonts w:cs="Times New Roman"/>
-          <w:szCs w:val="24"/>
-        </w:rPr>
-        <w:t>2</w:t>
-      </w:r>
-      <w:r>
-        <w:rPr>
-          <w:rFonts w:cs="Times New Roman"/>
-          <w:szCs w:val="24"/>
-        </w:rPr>
-        <w:t xml:space="preserve">0.000 lux között mozog, ezért </w:t>
-      </w:r>
-      <w:r>
-        <w:rPr>
-          <w:rFonts w:cs="Times New Roman"/>
-          <w:szCs w:val="24"/>
-        </w:rPr>
-        <w:t xml:space="preserve">ez a fényérzékelő tökéletesen megfelel, hiszen 1-től egészen </w:t>
-      </w:r>
-      <w:r>
-        <w:rPr>
-          <w:rFonts w:cs="Times New Roman"/>
-          <w:szCs w:val="24"/>
-        </w:rPr>
-        <w:t>65</w:t>
-      </w:r>
-      <w:r>
-        <w:rPr>
-          <w:rFonts w:cs="Times New Roman"/>
-          <w:szCs w:val="24"/>
-        </w:rPr>
-        <w:t>.</w:t>
-      </w:r>
       <w:r>
         <w:rPr>
           <w:rFonts w:cs="Times New Roman"/>
@@ -3229,6 +3154,14 @@
           <w:szCs w:val="24"/>
         </w:rPr>
         <w:t xml:space="preserve"> az elfogadható fényerősség viszonylag széles skálán mozog.</w:t>
+      </w:r>
+      <w:r>
+        <w:rPr>
+          <w:rStyle w:val="Lbjegyzet-hivatkozs"/>
+          <w:rFonts w:cs="Times New Roman"/>
+          <w:szCs w:val="24"/>
+        </w:rPr>
+        <w:footnoteReference w:id="5"/>
       </w:r>
       <w:sdt>
         <w:sdtPr>
@@ -3291,159 +3224,1155 @@
       <w:pPr>
         <w:pStyle w:val="Cmsor2"/>
       </w:pPr>
-      <w:bookmarkStart w:id="12" w:name="_Toc216401419"/>
-      <w:r>
-        <w:t xml:space="preserve">4.5 </w:t>
+      <w:bookmarkStart w:id="11" w:name="_Toc218266178"/>
+      <w:r>
+        <w:t>4.</w:t>
+      </w:r>
+      <w:r>
+        <w:t>4</w:t>
+      </w:r>
+      <w:r>
+        <w:t xml:space="preserve"> </w:t>
       </w:r>
       <w:r>
         <w:t>LCD kijelző</w:t>
       </w:r>
       <w:r>
         <w:t xml:space="preserve"> – KC-1602-GB</w:t>
+      </w:r>
+      <w:bookmarkEnd w:id="11"/>
+    </w:p>
+    <w:p>
+      <w:pPr>
+        <w:rPr>
+          <w:rFonts w:cs="Times New Roman"/>
+          <w:szCs w:val="24"/>
+        </w:rPr>
+      </w:pPr>
+      <w:r>
+        <w:rPr>
+          <w:rFonts w:cs="Times New Roman"/>
+          <w:szCs w:val="24"/>
+        </w:rPr>
+        <w:t>Annak érdekéb</w:t>
+      </w:r>
+      <w:r>
+        <w:rPr>
+          <w:rFonts w:cs="Times New Roman"/>
+          <w:szCs w:val="24"/>
+        </w:rPr>
+        <w:t>e</w:t>
+      </w:r>
+      <w:r>
+        <w:rPr>
+          <w:rFonts w:cs="Times New Roman"/>
+          <w:szCs w:val="24"/>
+        </w:rPr>
+        <w:t xml:space="preserve">n, hogy a növényünk aktuális állapotát az erre a célra készített weblap nélkül is </w:t>
+      </w:r>
+      <w:r>
+        <w:rPr>
+          <w:rFonts w:cs="Times New Roman"/>
+          <w:szCs w:val="24"/>
+        </w:rPr>
+        <w:t xml:space="preserve">leolvashassuk, az okos cserép részeként hozzáadásra kerül eg egyszerű LCD kijelző, amin </w:t>
+      </w:r>
+      <w:r>
+        <w:rPr>
+          <w:rFonts w:cs="Times New Roman"/>
+          <w:szCs w:val="24"/>
+        </w:rPr>
+        <w:t>a legfrissebben mért adatok kerülnek kiírásra.</w:t>
+      </w:r>
+    </w:p>
+    <w:p>
+      <w:pPr>
+        <w:pStyle w:val="Cmsor2"/>
+      </w:pPr>
+      <w:bookmarkStart w:id="12" w:name="_Toc218266179"/>
+      <w:r>
+        <w:t xml:space="preserve">4.5 Mikrokontroller – </w:t>
+      </w:r>
+      <w:proofErr w:type="spellStart"/>
+      <w:r>
+        <w:t>Arduino</w:t>
+      </w:r>
+      <w:proofErr w:type="spellEnd"/>
+      <w:r>
+        <w:t xml:space="preserve"> </w:t>
+      </w:r>
+      <w:proofErr w:type="spellStart"/>
+      <w:r>
+        <w:t>Uno</w:t>
+      </w:r>
+      <w:proofErr w:type="spellEnd"/>
+      <w:r>
+        <w:t xml:space="preserve"> R4 WiFi</w:t>
       </w:r>
       <w:bookmarkEnd w:id="12"/>
     </w:p>
     <w:p>
-      <w:pPr>
-        <w:rPr>
-          <w:rFonts w:cs="Times New Roman"/>
-          <w:szCs w:val="24"/>
-        </w:rPr>
-      </w:pPr>
-      <w:r>
-        <w:rPr>
-          <w:rFonts w:cs="Times New Roman"/>
-          <w:szCs w:val="24"/>
-        </w:rPr>
-        <w:t>Annak érdekéb</w:t>
-      </w:r>
-      <w:r>
-        <w:rPr>
-          <w:rFonts w:cs="Times New Roman"/>
-          <w:szCs w:val="24"/>
-        </w:rPr>
-        <w:t>e</w:t>
-      </w:r>
-      <w:r>
-        <w:rPr>
-          <w:rFonts w:cs="Times New Roman"/>
-          <w:szCs w:val="24"/>
-        </w:rPr>
-        <w:t xml:space="preserve">n, hogy a növényünk aktuális állapotát az erre a célra készített weblap nélkül is </w:t>
-      </w:r>
-      <w:r>
-        <w:rPr>
-          <w:rFonts w:cs="Times New Roman"/>
-          <w:szCs w:val="24"/>
-        </w:rPr>
-        <w:t xml:space="preserve">leolvashassuk, az okos cserép részeként hozzáadásra kerül eg egyszerű LCD kijelző, amin </w:t>
-      </w:r>
-      <w:r>
-        <w:rPr>
-          <w:rFonts w:cs="Times New Roman"/>
-          <w:szCs w:val="24"/>
-        </w:rPr>
-        <w:t>a legfrissebben mért adatok kerülnek kiírásra.</w:t>
+      <w:r>
+        <w:t xml:space="preserve">A mikrokontroller kiválasztása során figyelembe kellett vennem az </w:t>
+      </w:r>
+      <w:proofErr w:type="gramStart"/>
+      <w:r>
+        <w:t>analóg</w:t>
+      </w:r>
+      <w:proofErr w:type="gramEnd"/>
+      <w:r>
+        <w:t xml:space="preserve"> illetve digitális bemenetek számát, az üzemi feszültséget, a mikrokontroller </w:t>
+      </w:r>
+      <w:proofErr w:type="gramStart"/>
+      <w:r>
+        <w:t>árát</w:t>
+      </w:r>
+      <w:proofErr w:type="gramEnd"/>
+      <w:r>
+        <w:t xml:space="preserve"> illetve használatának egyszerűségét és korábbi tapasztalatot a használatával. A keresés során az </w:t>
+      </w:r>
+      <w:proofErr w:type="spellStart"/>
+      <w:r>
+        <w:t>arduino</w:t>
+      </w:r>
+      <w:proofErr w:type="spellEnd"/>
+      <w:r>
+        <w:t xml:space="preserve">-t részesítettem előnyben például egy </w:t>
+      </w:r>
+      <w:proofErr w:type="spellStart"/>
+      <w:r>
+        <w:t>raspberry</w:t>
+      </w:r>
+      <w:proofErr w:type="spellEnd"/>
+      <w:r>
+        <w:t xml:space="preserve">-vel szemben, mert a projekthez egy egyszerűbb eszköz is megfelelt és árban is kedvezőbb, ezentúl az </w:t>
+      </w:r>
+      <w:proofErr w:type="spellStart"/>
+      <w:r>
+        <w:t>arduino</w:t>
+      </w:r>
+      <w:proofErr w:type="spellEnd"/>
+      <w:r>
+        <w:t xml:space="preserve"> használatában már rendelkeztem korábbi tapasztalattal. Mindezeket figyelembe véve az eszköz, ami minden elvárásnak eleget tett, ezen túl elérhető is volt számomra az </w:t>
+      </w:r>
+      <w:proofErr w:type="spellStart"/>
+      <w:r>
+        <w:t>arduino</w:t>
+      </w:r>
+      <w:proofErr w:type="spellEnd"/>
+      <w:r>
+        <w:t xml:space="preserve"> </w:t>
+      </w:r>
+      <w:proofErr w:type="spellStart"/>
+      <w:r>
+        <w:t>uno</w:t>
+      </w:r>
+      <w:proofErr w:type="spellEnd"/>
+      <w:r>
+        <w:t xml:space="preserve"> wifi r4 volt. Ez a mikrokontroller 5 analóg és 13 digitális bemenettel rendelkezik, emellett biztosít 5 V üzemi feszültséget, amire a talajnedvesség szenzor miatt szükség is volt. Az </w:t>
+      </w:r>
+      <w:proofErr w:type="spellStart"/>
+      <w:r>
+        <w:t>arduino</w:t>
+      </w:r>
+      <w:proofErr w:type="spellEnd"/>
+      <w:r>
+        <w:t xml:space="preserve"> magában foglal egy wifi modult, ami nagyban megkönnyítette a webszerverrel való kommunikációját.</w:t>
       </w:r>
     </w:p>
     <w:p>
       <w:pPr>
         <w:pStyle w:val="Cmsor1"/>
       </w:pPr>
-      <w:bookmarkStart w:id="13" w:name="_Toc216401420"/>
+      <w:bookmarkStart w:id="13" w:name="_Toc218266180"/>
       <w:r>
         <w:lastRenderedPageBreak/>
-        <w:t>5. Megvalósítás</w:t>
+        <w:t xml:space="preserve">5. </w:t>
+      </w:r>
+      <w:r>
+        <w:t>Adatbázis</w:t>
       </w:r>
       <w:bookmarkEnd w:id="13"/>
+    </w:p>
+    <w:p>
+      <w:r>
+        <w:t>A már korábban bemutatott funkciók hátterében egy egyszerű, de a céln</w:t>
+      </w:r>
+      <w:r>
+        <w:t>a</w:t>
+      </w:r>
+      <w:r>
+        <w:t xml:space="preserve">k eleget tevő </w:t>
+      </w:r>
+      <w:proofErr w:type="spellStart"/>
+      <w:r>
+        <w:t>mysql</w:t>
+      </w:r>
+      <w:proofErr w:type="spellEnd"/>
+      <w:r>
+        <w:t xml:space="preserve"> adatbázis áll. Megtervezésénél hangsúlyos volt a táblák normalizálása. Az adatbázis 4 tábla teszi ki, ezek a következőek: </w:t>
+      </w:r>
+      <w:proofErr w:type="spellStart"/>
+      <w:r>
+        <w:t>plants_data</w:t>
+      </w:r>
+      <w:proofErr w:type="spellEnd"/>
+      <w:r>
+        <w:t xml:space="preserve">, </w:t>
+      </w:r>
+      <w:proofErr w:type="spellStart"/>
+      <w:r>
+        <w:t>users</w:t>
+      </w:r>
+      <w:proofErr w:type="spellEnd"/>
+      <w:r>
+        <w:t xml:space="preserve">, </w:t>
+      </w:r>
+      <w:proofErr w:type="spellStart"/>
+      <w:r>
+        <w:t>current_plants</w:t>
+      </w:r>
+      <w:proofErr w:type="spellEnd"/>
+      <w:r>
+        <w:t xml:space="preserve"> és </w:t>
+      </w:r>
+      <w:proofErr w:type="spellStart"/>
+      <w:r>
+        <w:t>weekly_data</w:t>
+      </w:r>
+      <w:proofErr w:type="spellEnd"/>
+      <w:r>
+        <w:t>. Vegyük őket részletesebben szemre.</w:t>
+      </w:r>
     </w:p>
     <w:p>
       <w:pPr>
         <w:pStyle w:val="Cmsor2"/>
       </w:pPr>
-      <w:bookmarkStart w:id="14" w:name="_Toc216401421"/>
+      <w:bookmarkStart w:id="14" w:name="_Toc218266181"/>
       <w:r>
         <w:t xml:space="preserve">5.1 </w:t>
       </w:r>
       <w:r>
-        <w:t>Szenzorok</w:t>
-      </w:r>
-      <w:r>
-        <w:rPr>
-          <w:rStyle w:val="Cmsor2Char"/>
+        <w:t xml:space="preserve">A </w:t>
+      </w:r>
+      <w:proofErr w:type="spellStart"/>
+      <w:r>
+        <w:t>plants_data</w:t>
+      </w:r>
+      <w:proofErr w:type="spellEnd"/>
+      <w:r>
+        <w:t xml:space="preserve"> tábla</w:t>
+      </w:r>
+      <w:bookmarkEnd w:id="14"/>
+    </w:p>
+    <w:tbl>
+      <w:tblPr>
+        <w:tblStyle w:val="Rcsostblzat"/>
+        <w:tblpPr w:leftFromText="141" w:rightFromText="141" w:vertAnchor="text" w:horzAnchor="margin" w:tblpY="4651"/>
+        <w:tblW w:w="8505" w:type="dxa"/>
+        <w:tblLook w:val="04A0" w:firstRow="1" w:lastRow="0" w:firstColumn="1" w:lastColumn="0" w:noHBand="0" w:noVBand="1"/>
+      </w:tblPr>
+      <w:tblGrid>
+        <w:gridCol w:w="2835"/>
+        <w:gridCol w:w="2835"/>
+        <w:gridCol w:w="2835"/>
+      </w:tblGrid>
+      <w:tr>
+        <w:trPr>
+          <w:trHeight w:val="567"/>
+        </w:trPr>
+        <w:tc>
+          <w:tcPr>
+            <w:tcW w:w="2835" w:type="dxa"/>
+            <w:shd w:val="clear" w:color="auto" w:fill="A5C9EB" w:themeFill="text2" w:themeFillTint="40"/>
+            <w:vAlign w:val="center"/>
+          </w:tcPr>
+          <w:p>
+            <w:pPr>
+              <w:pStyle w:val="Nincstrkz"/>
+              <w:jc w:val="center"/>
+              <w:rPr>
+                <w:b/>
+                <w:bCs/>
+              </w:rPr>
+            </w:pPr>
+            <w:r>
+              <w:rPr>
+                <w:b/>
+                <w:bCs/>
+              </w:rPr>
+              <w:t>árnyék kedvelő</w:t>
+            </w:r>
+          </w:p>
+        </w:tc>
+        <w:tc>
+          <w:tcPr>
+            <w:tcW w:w="2835" w:type="dxa"/>
+            <w:shd w:val="clear" w:color="auto" w:fill="A5C9EB" w:themeFill="text2" w:themeFillTint="40"/>
+            <w:vAlign w:val="center"/>
+          </w:tcPr>
+          <w:p>
+            <w:pPr>
+              <w:pStyle w:val="Nincstrkz"/>
+              <w:jc w:val="center"/>
+              <w:rPr>
+                <w:b/>
+                <w:bCs/>
+              </w:rPr>
+            </w:pPr>
+            <w:r>
+              <w:rPr>
+                <w:b/>
+                <w:bCs/>
+              </w:rPr>
+              <w:t>részben árnyék</w:t>
+            </w:r>
+            <w:r>
+              <w:rPr>
+                <w:b/>
+                <w:bCs/>
+              </w:rPr>
+              <w:t xml:space="preserve"> </w:t>
+            </w:r>
+            <w:r>
+              <w:rPr>
+                <w:b/>
+                <w:bCs/>
+              </w:rPr>
+              <w:t>kedvelő</w:t>
+            </w:r>
+          </w:p>
+        </w:tc>
+        <w:tc>
+          <w:tcPr>
+            <w:tcW w:w="2835" w:type="dxa"/>
+            <w:shd w:val="clear" w:color="auto" w:fill="A5C9EB" w:themeFill="text2" w:themeFillTint="40"/>
+            <w:vAlign w:val="center"/>
+          </w:tcPr>
+          <w:p>
+            <w:pPr>
+              <w:pStyle w:val="Nincstrkz"/>
+              <w:jc w:val="center"/>
+              <w:rPr>
+                <w:b/>
+                <w:bCs/>
+              </w:rPr>
+            </w:pPr>
+            <w:r>
+              <w:rPr>
+                <w:b/>
+                <w:bCs/>
+              </w:rPr>
+              <w:t>napsütés kedvelő</w:t>
+            </w:r>
+          </w:p>
+        </w:tc>
+      </w:tr>
+      <w:tr>
+        <w:trPr>
+          <w:trHeight w:val="624"/>
+        </w:trPr>
+        <w:tc>
+          <w:tcPr>
+            <w:tcW w:w="2835" w:type="dxa"/>
+            <w:shd w:val="clear" w:color="auto" w:fill="DAE9F7" w:themeFill="text2" w:themeFillTint="1A"/>
+          </w:tcPr>
+          <w:p>
+            <w:pPr>
+              <w:pStyle w:val="Nincstrkz"/>
+              <w:ind w:firstLine="0"/>
+              <w:jc w:val="left"/>
+            </w:pPr>
+            <w:r>
+              <w:t>kevesebb mint 3 órányi napsütés</w:t>
+            </w:r>
+          </w:p>
+        </w:tc>
+        <w:tc>
+          <w:tcPr>
+            <w:tcW w:w="2835" w:type="dxa"/>
+            <w:shd w:val="clear" w:color="auto" w:fill="DAE9F7" w:themeFill="text2" w:themeFillTint="1A"/>
+          </w:tcPr>
+          <w:p>
+            <w:pPr>
+              <w:pStyle w:val="Nincstrkz"/>
+              <w:ind w:firstLine="0"/>
+              <w:jc w:val="left"/>
+            </w:pPr>
+            <w:r>
+              <w:t>3-nál több, de 6 óránál kevesebb napsütés</w:t>
+            </w:r>
+          </w:p>
+        </w:tc>
+        <w:tc>
+          <w:tcPr>
+            <w:tcW w:w="2835" w:type="dxa"/>
+            <w:shd w:val="clear" w:color="auto" w:fill="DAE9F7" w:themeFill="text2" w:themeFillTint="1A"/>
+          </w:tcPr>
+          <w:p>
+            <w:pPr>
+              <w:pStyle w:val="Nincstrkz"/>
+              <w:ind w:firstLine="0"/>
+              <w:jc w:val="left"/>
+            </w:pPr>
+            <w:r>
+              <w:t>minimum 6 órányi napsütés</w:t>
+            </w:r>
+          </w:p>
+        </w:tc>
+      </w:tr>
+    </w:tbl>
+    <w:p>
+      <w:r>
+        <w:t xml:space="preserve">A </w:t>
+      </w:r>
+      <w:proofErr w:type="spellStart"/>
+      <w:r>
+        <w:t>plants</w:t>
+      </w:r>
+      <w:r>
+        <w:t>_</w:t>
+      </w:r>
+      <w:r>
+        <w:t>data</w:t>
+      </w:r>
+      <w:proofErr w:type="spellEnd"/>
+      <w:r>
+        <w:t xml:space="preserve"> tábla tartalmazza a lehetségesen megfigyelhető növények listáját, hétköznapi és </w:t>
+      </w:r>
+      <w:proofErr w:type="gramStart"/>
+      <w:r>
+        <w:t>tudományos  nevükkel</w:t>
+      </w:r>
+      <w:proofErr w:type="gramEnd"/>
+      <w:r>
+        <w:t xml:space="preserve">, valamint az egészséges növekedésükhöz szükséges ideális paraméterekkel. Ezek a paraméterek a következők: maximum, illetve minimum talajnedvesség szint, fény intenzitás, napi fény mennyiség, hőmérséklet és páratartalom. Az ideális körülmények meghatározása érdekében minden növény esetén külön kutatást végeztem. Elsősorban a New York Times </w:t>
+      </w:r>
+      <w:proofErr w:type="spellStart"/>
+      <w:r>
+        <w:t>Botanical</w:t>
+      </w:r>
+      <w:proofErr w:type="spellEnd"/>
+      <w:r>
+        <w:t xml:space="preserve"> </w:t>
+      </w:r>
+      <w:proofErr w:type="spellStart"/>
+      <w:r>
+        <w:t>Garden</w:t>
+      </w:r>
+      <w:proofErr w:type="spellEnd"/>
+      <w:r>
+        <w:t xml:space="preserve"> oldalát vettem alapul. A legtöbb növényhez viszont a hőmérséklet és páratartalom kivételével nehéz konkrétumokat találni, ezért ezeknél a paramétereknél külön kategóriákat határoztam meg a hozzávetőleges szükségletekből kiindulva. A napi fény mennyiségét 4 kategóriába soroltam: </w:t>
+      </w:r>
+      <w:hyperlink r:id="rId7" w:history="1">
+        <w:r>
+          <w:rPr>
+            <w:rStyle w:val="Hiperhivatkozs"/>
+          </w:rPr>
+          <w:t>https://plnts.com/en/blog/full-sun-partial-shade-and-shade-houseplants-understanding-the-terms</w:t>
+        </w:r>
+      </w:hyperlink>
+    </w:p>
+    <w:p>
+      <w:r>
+        <w:t xml:space="preserve">Hasonlóan osztottam be a fény intenzitását: </w:t>
+      </w:r>
+      <w:hyperlink r:id="rId8" w:history="1">
+        <w:r>
+          <w:rPr>
+            <w:rStyle w:val="Hiperhivatkozs"/>
+          </w:rPr>
+          <w:t>https://www.plantmaid.com/how-much-light-do-my-indoor-plants-need/</w:t>
+        </w:r>
+      </w:hyperlink>
+    </w:p>
+    <w:tbl>
+      <w:tblPr>
+        <w:tblStyle w:val="Rcsostblzat"/>
+        <w:tblpPr w:leftFromText="141" w:rightFromText="141" w:vertAnchor="text" w:horzAnchor="margin" w:tblpY="-33"/>
+        <w:tblW w:w="8497" w:type="dxa"/>
+        <w:tblLook w:val="04A0" w:firstRow="1" w:lastRow="0" w:firstColumn="1" w:lastColumn="0" w:noHBand="0" w:noVBand="1"/>
+      </w:tblPr>
+      <w:tblGrid>
+        <w:gridCol w:w="2126"/>
+        <w:gridCol w:w="2123"/>
+        <w:gridCol w:w="2124"/>
+        <w:gridCol w:w="2124"/>
+      </w:tblGrid>
+      <w:tr>
+        <w:trPr>
+          <w:trHeight w:val="567"/>
+        </w:trPr>
+        <w:tc>
+          <w:tcPr>
+            <w:tcW w:w="2126" w:type="dxa"/>
+            <w:shd w:val="clear" w:color="auto" w:fill="A5C9EB" w:themeFill="text2" w:themeFillTint="40"/>
+            <w:vAlign w:val="center"/>
+          </w:tcPr>
+          <w:p>
+            <w:pPr>
+              <w:pStyle w:val="Nincstrkz"/>
+              <w:ind w:firstLine="0"/>
+              <w:jc w:val="center"/>
+              <w:rPr>
+                <w:b/>
+                <w:bCs/>
+              </w:rPr>
+            </w:pPr>
+            <w:r>
+              <w:rPr>
+                <w:b/>
+                <w:bCs/>
+              </w:rPr>
+              <w:t>Alacsony fényigény</w:t>
+            </w:r>
+          </w:p>
+        </w:tc>
+        <w:tc>
+          <w:tcPr>
+            <w:tcW w:w="2123" w:type="dxa"/>
+            <w:shd w:val="clear" w:color="auto" w:fill="A5C9EB" w:themeFill="text2" w:themeFillTint="40"/>
+            <w:vAlign w:val="center"/>
+          </w:tcPr>
+          <w:p>
+            <w:pPr>
+              <w:pStyle w:val="Nincstrkz"/>
+              <w:ind w:firstLine="0"/>
+              <w:jc w:val="center"/>
+              <w:rPr>
+                <w:b/>
+                <w:bCs/>
+              </w:rPr>
+            </w:pPr>
+            <w:r>
+              <w:rPr>
+                <w:b/>
+                <w:bCs/>
+              </w:rPr>
+              <w:t>Közepes fényigény</w:t>
+            </w:r>
+          </w:p>
+        </w:tc>
+        <w:tc>
+          <w:tcPr>
+            <w:tcW w:w="2124" w:type="dxa"/>
+            <w:shd w:val="clear" w:color="auto" w:fill="A5C9EB" w:themeFill="text2" w:themeFillTint="40"/>
+            <w:vAlign w:val="center"/>
+          </w:tcPr>
+          <w:p>
+            <w:pPr>
+              <w:pStyle w:val="Nincstrkz"/>
+              <w:ind w:firstLine="0"/>
+              <w:jc w:val="center"/>
+              <w:rPr>
+                <w:b/>
+                <w:bCs/>
+              </w:rPr>
+            </w:pPr>
+            <w:r>
+              <w:rPr>
+                <w:b/>
+                <w:bCs/>
+              </w:rPr>
+              <w:t>Magas fényigény</w:t>
+            </w:r>
+          </w:p>
+        </w:tc>
+        <w:tc>
+          <w:tcPr>
+            <w:tcW w:w="2124" w:type="dxa"/>
+            <w:shd w:val="clear" w:color="auto" w:fill="A5C9EB" w:themeFill="text2" w:themeFillTint="40"/>
+            <w:vAlign w:val="center"/>
+          </w:tcPr>
+          <w:p>
+            <w:pPr>
+              <w:pStyle w:val="Nincstrkz"/>
+              <w:ind w:firstLine="0"/>
+              <w:jc w:val="center"/>
+              <w:rPr>
+                <w:b/>
+                <w:bCs/>
+              </w:rPr>
+            </w:pPr>
+            <w:r>
+              <w:rPr>
+                <w:b/>
+                <w:bCs/>
+              </w:rPr>
+              <w:t>Nagyon magas fényigény</w:t>
+            </w:r>
+          </w:p>
+        </w:tc>
+      </w:tr>
+      <w:tr>
+        <w:trPr>
+          <w:trHeight w:val="397"/>
+        </w:trPr>
+        <w:tc>
+          <w:tcPr>
+            <w:tcW w:w="2126" w:type="dxa"/>
+            <w:shd w:val="clear" w:color="auto" w:fill="DAE9F7" w:themeFill="text2" w:themeFillTint="1A"/>
+            <w:vAlign w:val="center"/>
+          </w:tcPr>
+          <w:p>
+            <w:pPr>
+              <w:pStyle w:val="Nincstrkz"/>
+              <w:ind w:firstLine="0"/>
+              <w:jc w:val="center"/>
+            </w:pPr>
+            <w:r>
+              <w:t>500-2500 lx</w:t>
+            </w:r>
+          </w:p>
+        </w:tc>
+        <w:tc>
+          <w:tcPr>
+            <w:tcW w:w="2123" w:type="dxa"/>
+            <w:shd w:val="clear" w:color="auto" w:fill="DAE9F7" w:themeFill="text2" w:themeFillTint="1A"/>
+            <w:vAlign w:val="center"/>
+          </w:tcPr>
+          <w:p>
+            <w:pPr>
+              <w:pStyle w:val="Nincstrkz"/>
+              <w:ind w:firstLine="0"/>
+              <w:jc w:val="center"/>
+            </w:pPr>
+            <w:r>
+              <w:t>2500-10000 lx</w:t>
+            </w:r>
+          </w:p>
+        </w:tc>
+        <w:tc>
+          <w:tcPr>
+            <w:tcW w:w="2124" w:type="dxa"/>
+            <w:shd w:val="clear" w:color="auto" w:fill="DAE9F7" w:themeFill="text2" w:themeFillTint="1A"/>
+            <w:vAlign w:val="center"/>
+          </w:tcPr>
+          <w:p>
+            <w:pPr>
+              <w:pStyle w:val="Nincstrkz"/>
+              <w:ind w:firstLine="0"/>
+              <w:jc w:val="center"/>
+            </w:pPr>
+            <w:r>
+              <w:t>10000-20000 lx</w:t>
+            </w:r>
+          </w:p>
+        </w:tc>
+        <w:tc>
+          <w:tcPr>
+            <w:tcW w:w="2124" w:type="dxa"/>
+            <w:shd w:val="clear" w:color="auto" w:fill="DAE9F7" w:themeFill="text2" w:themeFillTint="1A"/>
+            <w:vAlign w:val="center"/>
+          </w:tcPr>
+          <w:p>
+            <w:pPr>
+              <w:pStyle w:val="Nincstrkz"/>
+              <w:ind w:firstLine="0"/>
+              <w:jc w:val="center"/>
+            </w:pPr>
+            <w:r>
+              <w:t>20000-50000 lx</w:t>
+            </w:r>
+          </w:p>
+        </w:tc>
+      </w:tr>
+    </w:tbl>
+    <w:p>
+      <w:r>
+        <w:t xml:space="preserve">És a talajnedvesség igényt is: </w:t>
+      </w:r>
+      <w:hyperlink r:id="rId9" w:history="1">
+        <w:r>
+          <w:rPr>
+            <w:rStyle w:val="Hiperhivatkozs"/>
+          </w:rPr>
+          <w:t>https://www.flyrobo.in/blog/A-Guide-to-Using-the-Capacitive-Soil-Moisture-Sensor-V2-0</w:t>
+        </w:r>
+      </w:hyperlink>
+      <w:r>
+        <w:t xml:space="preserve"> </w:t>
+      </w:r>
+    </w:p>
+    <w:tbl>
+      <w:tblPr>
+        <w:tblStyle w:val="Rcsostblzat"/>
+        <w:tblW w:w="8506" w:type="dxa"/>
+        <w:tblLook w:val="04A0" w:firstRow="1" w:lastRow="0" w:firstColumn="1" w:lastColumn="0" w:noHBand="0" w:noVBand="1"/>
+      </w:tblPr>
+      <w:tblGrid>
+        <w:gridCol w:w="1701"/>
+        <w:gridCol w:w="1701"/>
+        <w:gridCol w:w="1701"/>
+        <w:gridCol w:w="42"/>
+        <w:gridCol w:w="1659"/>
+        <w:gridCol w:w="35"/>
+        <w:gridCol w:w="1667"/>
+      </w:tblGrid>
+      <w:tr>
+        <w:trPr>
+          <w:trHeight w:val="567"/>
+        </w:trPr>
+        <w:tc>
+          <w:tcPr>
+            <w:tcW w:w="1701" w:type="dxa"/>
+            <w:shd w:val="clear" w:color="auto" w:fill="A5C9EB" w:themeFill="text2" w:themeFillTint="40"/>
+            <w:vAlign w:val="center"/>
+          </w:tcPr>
+          <w:p>
+            <w:pPr>
+              <w:pStyle w:val="Nincstrkz"/>
+              <w:ind w:firstLine="0"/>
+              <w:jc w:val="center"/>
+              <w:rPr>
+                <w:b/>
+                <w:bCs/>
+              </w:rPr>
+            </w:pPr>
+            <w:r>
+              <w:rPr>
+                <w:b/>
+                <w:bCs/>
+              </w:rPr>
+              <w:t>Száraz</w:t>
+            </w:r>
+          </w:p>
+        </w:tc>
+        <w:tc>
+          <w:tcPr>
+            <w:tcW w:w="1701" w:type="dxa"/>
+            <w:shd w:val="clear" w:color="auto" w:fill="A5C9EB" w:themeFill="text2" w:themeFillTint="40"/>
+            <w:vAlign w:val="center"/>
+          </w:tcPr>
+          <w:p>
+            <w:pPr>
+              <w:pStyle w:val="Nincstrkz"/>
+              <w:ind w:firstLine="0"/>
+              <w:jc w:val="center"/>
+              <w:rPr>
+                <w:b/>
+                <w:bCs/>
+              </w:rPr>
+            </w:pPr>
+            <w:r>
+              <w:rPr>
+                <w:b/>
+                <w:bCs/>
+              </w:rPr>
+              <w:t>Enyhén nedves</w:t>
+            </w:r>
+          </w:p>
+        </w:tc>
+        <w:tc>
+          <w:tcPr>
+            <w:tcW w:w="1743" w:type="dxa"/>
+            <w:gridSpan w:val="2"/>
+            <w:shd w:val="clear" w:color="auto" w:fill="A5C9EB" w:themeFill="text2" w:themeFillTint="40"/>
+            <w:vAlign w:val="center"/>
+          </w:tcPr>
+          <w:p>
+            <w:pPr>
+              <w:pStyle w:val="Nincstrkz"/>
+              <w:ind w:firstLine="0"/>
+              <w:jc w:val="center"/>
+              <w:rPr>
+                <w:b/>
+                <w:bCs/>
+              </w:rPr>
+            </w:pPr>
+            <w:r>
+              <w:rPr>
+                <w:b/>
+                <w:bCs/>
+              </w:rPr>
+              <w:t>Közepesen nedves</w:t>
+            </w:r>
+          </w:p>
+        </w:tc>
+        <w:tc>
+          <w:tcPr>
+            <w:tcW w:w="1694" w:type="dxa"/>
+            <w:gridSpan w:val="2"/>
+            <w:shd w:val="clear" w:color="auto" w:fill="A5C9EB" w:themeFill="text2" w:themeFillTint="40"/>
+            <w:vAlign w:val="center"/>
+          </w:tcPr>
+          <w:p>
+            <w:pPr>
+              <w:pStyle w:val="Nincstrkz"/>
+              <w:ind w:firstLine="0"/>
+              <w:jc w:val="center"/>
+              <w:rPr>
+                <w:b/>
+                <w:bCs/>
+              </w:rPr>
+            </w:pPr>
+            <w:r>
+              <w:rPr>
+                <w:b/>
+                <w:bCs/>
+              </w:rPr>
+              <w:t>Nedves</w:t>
+            </w:r>
+          </w:p>
+        </w:tc>
+        <w:tc>
+          <w:tcPr>
+            <w:tcW w:w="1667" w:type="dxa"/>
+            <w:shd w:val="clear" w:color="auto" w:fill="A5C9EB" w:themeFill="text2" w:themeFillTint="40"/>
+            <w:vAlign w:val="center"/>
+          </w:tcPr>
+          <w:p>
+            <w:pPr>
+              <w:pStyle w:val="Nincstrkz"/>
+              <w:ind w:firstLine="0"/>
+              <w:jc w:val="center"/>
+              <w:rPr>
+                <w:b/>
+                <w:bCs/>
+              </w:rPr>
+            </w:pPr>
+            <w:r>
+              <w:rPr>
+                <w:b/>
+                <w:bCs/>
+              </w:rPr>
+              <w:t>Vizes</w:t>
+            </w:r>
+          </w:p>
+        </w:tc>
+      </w:tr>
+      <w:tr>
+        <w:trPr>
+          <w:trHeight w:val="397"/>
+        </w:trPr>
+        <w:tc>
+          <w:tcPr>
+            <w:tcW w:w="1701" w:type="dxa"/>
+            <w:shd w:val="clear" w:color="auto" w:fill="DAE9F7" w:themeFill="text2" w:themeFillTint="1A"/>
+            <w:vAlign w:val="center"/>
+          </w:tcPr>
+          <w:p>
+            <w:pPr>
+              <w:pStyle w:val="Nincstrkz"/>
+              <w:ind w:firstLine="0"/>
+              <w:jc w:val="center"/>
+            </w:pPr>
+            <w:r>
+              <w:lastRenderedPageBreak/>
+              <w:t>0-200</w:t>
+            </w:r>
+          </w:p>
+        </w:tc>
+        <w:tc>
+          <w:tcPr>
+            <w:tcW w:w="1701" w:type="dxa"/>
+            <w:shd w:val="clear" w:color="auto" w:fill="DAE9F7" w:themeFill="text2" w:themeFillTint="1A"/>
+            <w:vAlign w:val="center"/>
+          </w:tcPr>
+          <w:p>
+            <w:pPr>
+              <w:pStyle w:val="Nincstrkz"/>
+              <w:ind w:firstLine="0"/>
+              <w:jc w:val="center"/>
+            </w:pPr>
+            <w:r>
+              <w:t>200-400</w:t>
+            </w:r>
+          </w:p>
+        </w:tc>
+        <w:tc>
+          <w:tcPr>
+            <w:tcW w:w="1701" w:type="dxa"/>
+            <w:shd w:val="clear" w:color="auto" w:fill="DAE9F7" w:themeFill="text2" w:themeFillTint="1A"/>
+            <w:vAlign w:val="center"/>
+          </w:tcPr>
+          <w:p>
+            <w:pPr>
+              <w:pStyle w:val="Nincstrkz"/>
+              <w:ind w:firstLine="0"/>
+              <w:jc w:val="center"/>
+            </w:pPr>
+            <w:r>
+              <w:t>400-600</w:t>
+            </w:r>
+          </w:p>
+        </w:tc>
+        <w:tc>
+          <w:tcPr>
+            <w:tcW w:w="1701" w:type="dxa"/>
+            <w:gridSpan w:val="2"/>
+            <w:shd w:val="clear" w:color="auto" w:fill="DAE9F7" w:themeFill="text2" w:themeFillTint="1A"/>
+            <w:vAlign w:val="center"/>
+          </w:tcPr>
+          <w:p>
+            <w:pPr>
+              <w:pStyle w:val="Nincstrkz"/>
+              <w:ind w:firstLine="0"/>
+              <w:jc w:val="center"/>
+            </w:pPr>
+            <w:r>
+              <w:t>600-800</w:t>
+            </w:r>
+          </w:p>
+        </w:tc>
+        <w:tc>
+          <w:tcPr>
+            <w:tcW w:w="1702" w:type="dxa"/>
+            <w:gridSpan w:val="2"/>
+            <w:shd w:val="clear" w:color="auto" w:fill="DAE9F7" w:themeFill="text2" w:themeFillTint="1A"/>
+            <w:vAlign w:val="center"/>
+          </w:tcPr>
+          <w:p>
+            <w:pPr>
+              <w:pStyle w:val="Nincstrkz"/>
+              <w:ind w:firstLine="0"/>
+              <w:jc w:val="center"/>
+            </w:pPr>
+            <w:r>
+              <w:t>800-1023</w:t>
+            </w:r>
+          </w:p>
+        </w:tc>
+      </w:tr>
+    </w:tbl>
+    <w:p>
+      <w:r>
+        <w:t xml:space="preserve">Ebben a táblában a növény hétköznapi neve funkcionál elsődleges kulcsként, ezért egyedinek is kell lennie, ezzel </w:t>
+      </w:r>
+      <w:proofErr w:type="gramStart"/>
+      <w:r>
+        <w:t>megakadályozva</w:t>
+      </w:r>
+      <w:proofErr w:type="gramEnd"/>
+      <w:r>
+        <w:t xml:space="preserve"> hogy ugyanahhoz a növényhez egymást kontradiktáló adatok legyenek feljegyezve. Ez az egyetlen tábla, amit az applikáción keresztül a felhasználó nem tud módosítani.</w:t>
+      </w:r>
+    </w:p>
+    <w:p>
+      <w:pPr>
+        <w:pStyle w:val="Cmsor2"/>
+      </w:pPr>
+      <w:bookmarkStart w:id="15" w:name="_Toc218266182"/>
+      <w:r>
+        <w:t xml:space="preserve">5.2 A </w:t>
+      </w:r>
+      <w:proofErr w:type="spellStart"/>
+      <w:r>
+        <w:t>users</w:t>
+      </w:r>
+      <w:proofErr w:type="spellEnd"/>
+      <w:r>
+        <w:t xml:space="preserve"> tábla</w:t>
+      </w:r>
+      <w:bookmarkEnd w:id="15"/>
+    </w:p>
+    <w:p>
+      <w:r>
+        <w:t xml:space="preserve">A következő tábla, amit megnézünk a </w:t>
+      </w:r>
+      <w:proofErr w:type="spellStart"/>
+      <w:r>
+        <w:rPr>
           <w:b/>
-        </w:rPr>
-        <w:t xml:space="preserve"> összekötése</w:t>
-      </w:r>
-      <w:r>
-        <w:rPr>
-          <w:rStyle w:val="Cmsor2Char"/>
+          <w:bCs/>
+        </w:rPr>
+        <w:t>users</w:t>
+      </w:r>
+      <w:proofErr w:type="spellEnd"/>
+      <w:r>
+        <w:rPr>
           <w:b/>
+          <w:bCs/>
         </w:rPr>
         <w:t xml:space="preserve"> </w:t>
       </w:r>
+      <w:r>
+        <w:t xml:space="preserve">tábla. Erre a táblára azért volt szükség, hogy ha a jövőben a projekt </w:t>
+      </w:r>
       <w:proofErr w:type="spellStart"/>
       <w:r>
-        <w:rPr>
-          <w:rStyle w:val="Cmsor2Char"/>
-          <w:b/>
-        </w:rPr>
-        <w:t>Arduinoval</w:t>
-      </w:r>
-      <w:bookmarkEnd w:id="14"/>
+        <w:t>potencionálisan</w:t>
+      </w:r>
+      <w:proofErr w:type="spellEnd"/>
+      <w:r>
+        <w:t xml:space="preserve"> továbbfejlesztésre kerülne és több </w:t>
+      </w:r>
+      <w:proofErr w:type="spellStart"/>
+      <w:r>
+        <w:t>arduinot</w:t>
+      </w:r>
+      <w:proofErr w:type="spellEnd"/>
+      <w:r>
+        <w:t xml:space="preserve"> is magába foglalna, ezzel lehetővé téve egyidejűleg több növény megfigyelését, esetlegesen különböző felhasználók által, akkor nyomon követhető legyen melyik növény kihez tartozik, és a webes applikáció használatakor csak az éppen bejelentkezett felhasználóhoz tartozó növények legyenek megjelenítve, ezzel megakadályozva, hogy a különböző felhasználók egymás adataihoz hozzáférjenek, azokat módosítani tudják. Ebben a táblában </w:t>
+      </w:r>
+      <w:proofErr w:type="gramStart"/>
+      <w:r>
+        <w:t>helyet  kapott</w:t>
+      </w:r>
+      <w:proofErr w:type="gramEnd"/>
+      <w:r>
+        <w:t xml:space="preserve"> egy egyedi azonosító (</w:t>
+      </w:r>
+      <w:proofErr w:type="spellStart"/>
+      <w:r>
+        <w:t>id</w:t>
+      </w:r>
+      <w:proofErr w:type="spellEnd"/>
+      <w:r>
+        <w:t>), a felhasználó neve (</w:t>
+      </w:r>
+      <w:proofErr w:type="spellStart"/>
+      <w:r>
+        <w:t>name</w:t>
+      </w:r>
+      <w:proofErr w:type="spellEnd"/>
+      <w:r>
+        <w:t>, az azonosító lehetővé teszi, hogy több felhasználó ugyanazon a néven fusson) és egy jelszó mező (</w:t>
+      </w:r>
+      <w:proofErr w:type="spellStart"/>
+      <w:r>
+        <w:t>password</w:t>
+      </w:r>
+      <w:proofErr w:type="spellEnd"/>
+      <w:r>
+        <w:t>) amely titkosítva tárolja a felhasználók jelszavát. Ennek a táblának a módosításához nem szükséges különleges hozzáférés, bárki adhat hozzá új felhasználót. A felhasználók törlése viszont csak a bejelentkezés után lehetséges. A felhasználók így csak a saját „fiókjukat” törölhetik, ezzel törölve minden hozzájuk tartozó adatot is a többi táblából.</w:t>
+      </w:r>
+    </w:p>
+    <w:p>
+      <w:pPr>
+        <w:pStyle w:val="Cmsor2"/>
+      </w:pPr>
+      <w:bookmarkStart w:id="16" w:name="_Toc218266183"/>
+      <w:r>
+        <w:t xml:space="preserve">5.3 A </w:t>
+      </w:r>
+      <w:proofErr w:type="spellStart"/>
+      <w:r>
+        <w:t>current_plants</w:t>
+      </w:r>
+      <w:bookmarkEnd w:id="16"/>
       <w:proofErr w:type="spellEnd"/>
     </w:p>
     <w:p>
+      <w:r>
+        <w:t xml:space="preserve">A következő tábla, amiről szót kell ejtenünk, az a </w:t>
+      </w:r>
+      <w:proofErr w:type="spellStart"/>
+      <w:r>
+        <w:rPr>
+          <w:b/>
+          <w:bCs/>
+        </w:rPr>
+        <w:t>current_plants</w:t>
+      </w:r>
+      <w:proofErr w:type="spellEnd"/>
+      <w:r>
+        <w:t xml:space="preserve"> tábla. Ebben a táblában gyűjtjük össze, hogy éppen milyen növények vannak valamilyen felhasználóhoz rendelve. A tábla és az adatbázis lehetővé tesz egyszerre több felhasználóhoz tartozó akár több növény tárolását is. Ennek érdekében a tábla tartalmaz egy egyedi azonosítót (</w:t>
+      </w:r>
+      <w:proofErr w:type="spellStart"/>
+      <w:r>
+        <w:t>id</w:t>
+      </w:r>
+      <w:proofErr w:type="spellEnd"/>
+      <w:r>
+        <w:t xml:space="preserve">), ami egyértelműen azonosítja a növényt (ez később a mért adatok eltárolásánál lesz fontos), a növény hétköznapi nevét (ez a mező kapcsolja össze a </w:t>
+      </w:r>
+      <w:proofErr w:type="spellStart"/>
+      <w:r>
+        <w:t>plants_data</w:t>
+      </w:r>
+      <w:proofErr w:type="spellEnd"/>
+      <w:r>
+        <w:t xml:space="preserve"> táblával, így tudjuk lekérdezni az adott növény szükségleteinek kielégítéséhez szükséges adatokat) és </w:t>
+      </w:r>
+      <w:r>
+        <w:lastRenderedPageBreak/>
+        <w:t xml:space="preserve">egy </w:t>
+      </w:r>
+      <w:proofErr w:type="spellStart"/>
+      <w:r>
+        <w:t>user_id</w:t>
+      </w:r>
+      <w:proofErr w:type="spellEnd"/>
+      <w:r>
+        <w:t xml:space="preserve"> mezőt, ami segít meghatározni, hogy melyik növény melyik felhasználóhoz tartozik.</w:t>
+      </w:r>
+    </w:p>
+    <w:p>
       <w:pPr>
-        <w:rPr>
-          <w:rFonts w:cs="Times New Roman"/>
-          <w:szCs w:val="24"/>
-        </w:rPr>
+        <w:pStyle w:val="Cmsor2"/>
       </w:pPr>
-      <w:r>
-        <w:rPr>
-          <w:rFonts w:cs="Times New Roman"/>
-          <w:szCs w:val="24"/>
-        </w:rPr>
-        <w:t xml:space="preserve">Az okos virágcserép elkészítésének ezen szakasza </w:t>
-      </w:r>
-      <w:r>
-        <w:rPr>
-          <w:rFonts w:cs="Times New Roman"/>
-          <w:szCs w:val="24"/>
-        </w:rPr>
-        <w:t xml:space="preserve">egyszerűnek bizonyosult. </w:t>
-      </w:r>
-      <w:r>
-        <w:rPr>
-          <w:rFonts w:cs="Times New Roman"/>
-          <w:szCs w:val="24"/>
-        </w:rPr>
-        <w:t xml:space="preserve">Az Arduino készülék, amit a projekthez használok egy </w:t>
-      </w:r>
-      <w:r>
-        <w:rPr>
-          <w:rFonts w:cs="Times New Roman"/>
-          <w:szCs w:val="24"/>
-        </w:rPr>
-        <w:t xml:space="preserve">Arduino Uno R4 Wifi, ami </w:t>
-      </w:r>
-      <w:r>
-        <w:rPr>
-          <w:rFonts w:cs="Times New Roman"/>
-          <w:szCs w:val="24"/>
-        </w:rPr>
-        <w:t>többek között tartalmaz egy beépített Bluetooth, illetve WiFi modult.</w:t>
-      </w:r>
+      <w:bookmarkStart w:id="17" w:name="_Toc218266184"/>
+      <w:r>
+        <w:t xml:space="preserve">5.4 A </w:t>
+      </w:r>
+      <w:proofErr w:type="spellStart"/>
+      <w:r>
+        <w:t>weekly_data</w:t>
+      </w:r>
+      <w:proofErr w:type="spellEnd"/>
+      <w:r>
+        <w:t xml:space="preserve"> tábla</w:t>
+      </w:r>
+      <w:bookmarkEnd w:id="17"/>
     </w:p>
-    <w:bookmarkStart w:id="15" w:name="_Toc216401422" w:displacedByCustomXml="next"/>
+    <w:p>
+      <w:r>
+        <w:t xml:space="preserve">Az utolsó tábla az adatbázisban a </w:t>
+      </w:r>
+      <w:proofErr w:type="spellStart"/>
+      <w:r>
+        <w:t>weekly_data</w:t>
+      </w:r>
+      <w:proofErr w:type="spellEnd"/>
+      <w:r>
+        <w:t xml:space="preserve">. A nevet azért kapta, mert csak a legutóbbi 7 nap adatait tárolja el, az ennél </w:t>
+      </w:r>
+      <w:proofErr w:type="spellStart"/>
+      <w:r>
+        <w:t>régebbieket</w:t>
+      </w:r>
+      <w:proofErr w:type="spellEnd"/>
+      <w:r>
+        <w:t xml:space="preserve"> automatikusan törli új adat </w:t>
+      </w:r>
+      <w:proofErr w:type="spellStart"/>
+      <w:r>
+        <w:t>fel</w:t>
+      </w:r>
+      <w:r>
+        <w:t>t</w:t>
+      </w:r>
+      <w:r>
+        <w:t>ölésekor</w:t>
+      </w:r>
+      <w:proofErr w:type="spellEnd"/>
+      <w:r>
+        <w:t xml:space="preserve">. Ez a tábla tartalmazza az </w:t>
+      </w:r>
+      <w:proofErr w:type="spellStart"/>
+      <w:r>
+        <w:t>arduino</w:t>
+      </w:r>
+      <w:proofErr w:type="spellEnd"/>
+      <w:r>
+        <w:t xml:space="preserve"> által mért adatokat, amiket az 15 percenként küldd el a webszervernek. Ezeket az adatokat a </w:t>
+      </w:r>
+      <w:proofErr w:type="spellStart"/>
+      <w:r>
+        <w:t>current_plant_id</w:t>
+      </w:r>
+      <w:proofErr w:type="spellEnd"/>
+      <w:r>
+        <w:t xml:space="preserve"> mező segítségével rendeli egy adott növényhez.</w:t>
+      </w:r>
+    </w:p>
+    <w:bookmarkStart w:id="18" w:name="_Toc218266185" w:displacedByCustomXml="next"/>
     <w:sdt>
       <w:sdtPr>
         <w:rPr>
           <w:rFonts w:ascii="Times New Roman" w:eastAsiaTheme="minorHAnsi" w:hAnsi="Times New Roman" w:cstheme="minorBidi"/>
-          <w:b w:val="0"/>
-          <w:bCs w:val="0"/>
-          <w:caps w:val="0"/>
           <w:sz w:val="24"/>
           <w:szCs w:val="22"/>
         </w:rPr>
@@ -3453,6 +4382,13 @@
           <w:docPartUnique/>
         </w:docPartObj>
       </w:sdtPr>
+      <w:sdtEndPr>
+        <w:rPr>
+          <w:b w:val="0"/>
+          <w:bCs w:val="0"/>
+          <w:caps w:val="0"/>
+        </w:rPr>
+      </w:sdtEndPr>
       <w:sdtContent>
         <w:p>
           <w:pPr>
@@ -3461,7 +4397,7 @@
           <w:r>
             <w:t>Irodalomjegyzék</w:t>
           </w:r>
-          <w:bookmarkEnd w:id="15"/>
+          <w:bookmarkEnd w:id="18"/>
         </w:p>
         <w:sdt>
           <w:sdtPr>
@@ -3591,7 +4527,7 @@
       </w:pPr>
     </w:p>
     <w:sectPr>
-      <w:footerReference w:type="default" r:id="rId7"/>
+      <w:footerReference w:type="default" r:id="rId10"/>
       <w:pgSz w:w="11906" w:h="16838" w:code="9"/>
       <w:pgMar w:top="2268" w:right="1418" w:bottom="1418" w:left="1985" w:header="709" w:footer="709" w:gutter="0"/>
       <w:pgBorders w:offsetFrom="page">
@@ -3704,6 +4640,267 @@
       </w:pPr>
       <w:r>
         <w:continuationSeparator/>
+      </w:r>
+    </w:p>
+  </w:footnote>
+  <w:footnote w:id="1">
+    <w:p>
+      <w:pPr>
+        <w:pStyle w:val="Lbjegyzetszveg"/>
+      </w:pPr>
+      <w:r>
+        <w:rPr>
+          <w:rStyle w:val="Lbjegyzet-hivatkozs"/>
+        </w:rPr>
+        <w:footnoteRef/>
+      </w:r>
+      <w:r>
+        <w:t xml:space="preserve"> </w:t>
+      </w:r>
+      <w:sdt>
+        <w:sdtPr>
+          <w:rPr>
+            <w:rFonts w:cs="Times New Roman"/>
+            <w:szCs w:val="24"/>
+          </w:rPr>
+          <w:id w:val="2026133385"/>
+          <w:citation/>
+        </w:sdtPr>
+        <w:sdtContent>
+          <w:r>
+            <w:rPr>
+              <w:rFonts w:cs="Times New Roman"/>
+              <w:szCs w:val="24"/>
+            </w:rPr>
+            <w:fldChar w:fldCharType="begin"/>
+          </w:r>
+          <w:r>
+            <w:rPr>
+              <w:rFonts w:cs="Times New Roman"/>
+              <w:szCs w:val="24"/>
+            </w:rPr>
+            <w:instrText xml:space="preserve">CITATION 1 \l 1038 </w:instrText>
+          </w:r>
+          <w:r>
+            <w:rPr>
+              <w:rFonts w:cs="Times New Roman"/>
+              <w:szCs w:val="24"/>
+            </w:rPr>
+            <w:fldChar w:fldCharType="separate"/>
+          </w:r>
+          <w:r>
+            <w:rPr>
+              <w:rFonts w:cs="Times New Roman"/>
+              <w:noProof/>
+              <w:szCs w:val="24"/>
+            </w:rPr>
+            <w:t xml:space="preserve"> </w:t>
+          </w:r>
+          <w:r>
+            <w:rPr>
+              <w:rFonts w:cs="Times New Roman"/>
+              <w:noProof/>
+              <w:szCs w:val="24"/>
+            </w:rPr>
+            <w:t>(Weisenhorn &amp; Hoidal, 2024)</w:t>
+          </w:r>
+          <w:r>
+            <w:rPr>
+              <w:rFonts w:cs="Times New Roman"/>
+              <w:szCs w:val="24"/>
+            </w:rPr>
+            <w:fldChar w:fldCharType="end"/>
+          </w:r>
+        </w:sdtContent>
+      </w:sdt>
+    </w:p>
+  </w:footnote>
+  <w:footnote w:id="2">
+    <w:p>
+      <w:pPr>
+        <w:pStyle w:val="lbjegyzet"/>
+        <w:spacing w:after="120" w:line="240" w:lineRule="auto"/>
+      </w:pPr>
+      <w:r>
+        <w:rPr>
+          <w:rStyle w:val="Lbjegyzet-hivatkozs"/>
+        </w:rPr>
+        <w:footnoteRef/>
+      </w:r>
+      <w:sdt>
+        <w:sdtPr>
+          <w:id w:val="1180465604"/>
+          <w:citation/>
+        </w:sdtPr>
+        <w:sdtContent>
+          <w:r>
+            <w:fldChar w:fldCharType="begin"/>
+          </w:r>
+          <w:r>
+            <w:instrText xml:space="preserve">CITATION 2 \l 1038 </w:instrText>
+          </w:r>
+          <w:r>
+            <w:fldChar w:fldCharType="separate"/>
+          </w:r>
+          <w:r>
+            <w:rPr>
+              <w:noProof/>
+            </w:rPr>
+            <w:t xml:space="preserve"> </w:t>
+          </w:r>
+          <w:r>
+            <w:rPr>
+              <w:noProof/>
+            </w:rPr>
+            <w:t>(Richmond, 2021)</w:t>
+          </w:r>
+          <w:r>
+            <w:fldChar w:fldCharType="end"/>
+          </w:r>
+        </w:sdtContent>
+      </w:sdt>
+      <w:sdt>
+        <w:sdtPr>
+          <w:id w:val="-139497519"/>
+          <w:citation/>
+        </w:sdtPr>
+        <w:sdtContent>
+          <w:r>
+            <w:fldChar w:fldCharType="begin"/>
+          </w:r>
+          <w:r>
+            <w:instrText xml:space="preserve">CITATION 3 \l 1038 </w:instrText>
+          </w:r>
+          <w:r>
+            <w:fldChar w:fldCharType="separate"/>
+          </w:r>
+          <w:r>
+            <w:rPr>
+              <w:noProof/>
+            </w:rPr>
+            <w:t xml:space="preserve"> </w:t>
+          </w:r>
+          <w:r>
+            <w:rPr>
+              <w:noProof/>
+            </w:rPr>
+            <w:t>(Clement &amp; Malinoski, 2023)</w:t>
+          </w:r>
+          <w:r>
+            <w:fldChar w:fldCharType="end"/>
+          </w:r>
+        </w:sdtContent>
+      </w:sdt>
+    </w:p>
+  </w:footnote>
+  <w:footnote w:id="3">
+    <w:p>
+      <w:pPr>
+        <w:pStyle w:val="lbjegyzet"/>
+        <w:spacing w:after="120" w:line="240" w:lineRule="auto"/>
+      </w:pPr>
+      <w:r>
+        <w:rPr>
+          <w:rStyle w:val="Lbjegyzet-hivatkozs"/>
+        </w:rPr>
+        <w:footnoteRef/>
+      </w:r>
+      <w:sdt>
+        <w:sdtPr>
+          <w:id w:val="898635304"/>
+          <w:citation/>
+        </w:sdtPr>
+        <w:sdtContent>
+          <w:r>
+            <w:fldChar w:fldCharType="begin"/>
+          </w:r>
+          <w:r>
+            <w:instrText xml:space="preserve"> CITATION Van24 \l 1038 </w:instrText>
+          </w:r>
+          <w:r>
+            <w:fldChar w:fldCharType="separate"/>
+          </w:r>
+          <w:r>
+            <w:rPr>
+              <w:noProof/>
+            </w:rPr>
+            <w:t xml:space="preserve"> </w:t>
+          </w:r>
+          <w:r>
+            <w:rPr>
+              <w:noProof/>
+            </w:rPr>
+            <w:t>(VanDerZanden, 2024)</w:t>
+          </w:r>
+          <w:r>
+            <w:fldChar w:fldCharType="end"/>
+          </w:r>
+        </w:sdtContent>
+      </w:sdt>
+    </w:p>
+  </w:footnote>
+  <w:footnote w:id="4">
+    <w:p>
+      <w:pPr>
+        <w:pStyle w:val="lbjegyzet"/>
+        <w:spacing w:after="120" w:line="240" w:lineRule="auto"/>
+      </w:pPr>
+      <w:r>
+        <w:rPr>
+          <w:rStyle w:val="Lbjegyzet-hivatkozs"/>
+        </w:rPr>
+        <w:footnoteRef/>
+      </w:r>
+      <w:r>
+        <w:t xml:space="preserve"> </w:t>
+      </w:r>
+      <w:sdt>
+        <w:sdtPr>
+          <w:id w:val="1438649826"/>
+          <w:citation/>
+        </w:sdtPr>
+        <w:sdtContent>
+          <w:r>
+            <w:fldChar w:fldCharType="begin"/>
+          </w:r>
+          <w:r>
+            <w:instrText xml:space="preserve">CITATION Blo \y  \l 1038 </w:instrText>
+          </w:r>
+          <w:r>
+            <w:fldChar w:fldCharType="separate"/>
+          </w:r>
+          <w:r>
+            <w:rPr>
+              <w:noProof/>
+            </w:rPr>
+            <w:t xml:space="preserve"> </w:t>
+          </w:r>
+          <w:r>
+            <w:rPr>
+              <w:noProof/>
+            </w:rPr>
+            <w:t>(Polygon – Blog – Temporary Climate Solutions)</w:t>
+          </w:r>
+          <w:r>
+            <w:fldChar w:fldCharType="end"/>
+          </w:r>
+        </w:sdtContent>
+      </w:sdt>
+    </w:p>
+  </w:footnote>
+  <w:footnote w:id="5">
+    <w:p>
+      <w:pPr>
+        <w:pStyle w:val="Lbjegyzetszveg"/>
+      </w:pPr>
+      <w:r>
+        <w:rPr>
+          <w:rStyle w:val="Lbjegyzet-hivatkozs"/>
+        </w:rPr>
+        <w:footnoteRef/>
+      </w:r>
+      <w:r>
+        <w:t xml:space="preserve"> </w:t>
       </w:r>
     </w:p>
   </w:footnote>
@@ -4129,7 +5326,7 @@
     <w:autoRedefine/>
     <w:uiPriority w:val="9"/>
     <w:qFormat/>
-    <w:rsid w:val="00543594"/>
+    <w:rsid w:val="00541F6E"/>
     <w:pPr>
       <w:keepNext/>
       <w:keepLines/>
@@ -4328,7 +5525,6 @@
   <w:style w:type="character" w:default="1" w:styleId="Bekezdsalapbettpusa">
     <w:name w:val="Default Paragraph Font"/>
     <w:uiPriority w:val="1"/>
-    <w:semiHidden/>
     <w:unhideWhenUsed/>
   </w:style>
   <w:style w:type="table" w:default="1" w:styleId="Normltblzat">
@@ -4357,7 +5553,7 @@
     <w:basedOn w:val="Bekezdsalapbettpusa"/>
     <w:link w:val="Cmsor1"/>
     <w:uiPriority w:val="9"/>
-    <w:rsid w:val="00543594"/>
+    <w:rsid w:val="00541F6E"/>
     <w:rPr>
       <w:rFonts w:ascii="Arial" w:eastAsiaTheme="majorEastAsia" w:hAnsi="Arial" w:cstheme="majorBidi"/>
       <w:b/>
@@ -4850,6 +6046,154 @@
     <w:uiPriority w:val="37"/>
     <w:unhideWhenUsed/>
     <w:rsid w:val="00FA7CDE"/>
+  </w:style>
+  <w:style w:type="character" w:styleId="Feloldatlanmegemlts">
+    <w:name w:val="Unresolved Mention"/>
+    <w:basedOn w:val="Bekezdsalapbettpusa"/>
+    <w:uiPriority w:val="99"/>
+    <w:semiHidden/>
+    <w:unhideWhenUsed/>
+    <w:rsid w:val="00BE4C23"/>
+    <w:rPr>
+      <w:color w:val="605E5C"/>
+      <w:shd w:val="clear" w:color="auto" w:fill="E1DFDD"/>
+    </w:rPr>
+  </w:style>
+  <w:style w:type="table" w:styleId="Rcsostblzat">
+    <w:name w:val="Table Grid"/>
+    <w:basedOn w:val="Normltblzat"/>
+    <w:uiPriority w:val="39"/>
+    <w:rsid w:val="00BE4C23"/>
+    <w:pPr>
+      <w:spacing w:after="0" w:line="240" w:lineRule="auto"/>
+    </w:pPr>
+    <w:tblPr>
+      <w:tblBorders>
+        <w:top w:val="single" w:sz="4" w:space="0" w:color="auto"/>
+        <w:left w:val="single" w:sz="4" w:space="0" w:color="auto"/>
+        <w:bottom w:val="single" w:sz="4" w:space="0" w:color="auto"/>
+        <w:right w:val="single" w:sz="4" w:space="0" w:color="auto"/>
+        <w:insideH w:val="single" w:sz="4" w:space="0" w:color="auto"/>
+        <w:insideV w:val="single" w:sz="4" w:space="0" w:color="auto"/>
+      </w:tblBorders>
+    </w:tblPr>
+  </w:style>
+  <w:style w:type="paragraph" w:styleId="Nincstrkz">
+    <w:name w:val="No Spacing"/>
+    <w:uiPriority w:val="1"/>
+    <w:qFormat/>
+    <w:rsid w:val="00BE4C23"/>
+    <w:pPr>
+      <w:spacing w:after="0" w:line="240" w:lineRule="auto"/>
+      <w:ind w:firstLine="340"/>
+      <w:jc w:val="both"/>
+    </w:pPr>
+    <w:rPr>
+      <w:rFonts w:ascii="Times New Roman" w:hAnsi="Times New Roman"/>
+      <w:sz w:val="24"/>
+    </w:rPr>
+  </w:style>
+  <w:style w:type="table" w:styleId="Tblzatrcsos41jellszn">
+    <w:name w:val="Grid Table 4 Accent 1"/>
+    <w:basedOn w:val="Normltblzat"/>
+    <w:uiPriority w:val="49"/>
+    <w:rsid w:val="00BE4C23"/>
+    <w:pPr>
+      <w:spacing w:after="0" w:line="240" w:lineRule="auto"/>
+    </w:pPr>
+    <w:tblPr>
+      <w:tblStyleRowBandSize w:val="1"/>
+      <w:tblStyleColBandSize w:val="1"/>
+      <w:tblBorders>
+        <w:top w:val="single" w:sz="4" w:space="0" w:color="45B0E1" w:themeColor="accent1" w:themeTint="99"/>
+        <w:left w:val="single" w:sz="4" w:space="0" w:color="45B0E1" w:themeColor="accent1" w:themeTint="99"/>
+        <w:bottom w:val="single" w:sz="4" w:space="0" w:color="45B0E1" w:themeColor="accent1" w:themeTint="99"/>
+        <w:right w:val="single" w:sz="4" w:space="0" w:color="45B0E1" w:themeColor="accent1" w:themeTint="99"/>
+        <w:insideH w:val="single" w:sz="4" w:space="0" w:color="45B0E1" w:themeColor="accent1" w:themeTint="99"/>
+        <w:insideV w:val="single" w:sz="4" w:space="0" w:color="45B0E1" w:themeColor="accent1" w:themeTint="99"/>
+      </w:tblBorders>
+    </w:tblPr>
+    <w:tblStylePr w:type="firstRow">
+      <w:rPr>
+        <w:b/>
+        <w:bCs/>
+        <w:color w:val="FFFFFF" w:themeColor="background1"/>
+      </w:rPr>
+      <w:tblPr/>
+      <w:tcPr>
+        <w:tcBorders>
+          <w:top w:val="single" w:sz="4" w:space="0" w:color="156082" w:themeColor="accent1"/>
+          <w:left w:val="single" w:sz="4" w:space="0" w:color="156082" w:themeColor="accent1"/>
+          <w:bottom w:val="single" w:sz="4" w:space="0" w:color="156082" w:themeColor="accent1"/>
+          <w:right w:val="single" w:sz="4" w:space="0" w:color="156082" w:themeColor="accent1"/>
+          <w:insideH w:val="nil"/>
+          <w:insideV w:val="nil"/>
+        </w:tcBorders>
+        <w:shd w:val="clear" w:color="auto" w:fill="156082" w:themeFill="accent1"/>
+      </w:tcPr>
+    </w:tblStylePr>
+    <w:tblStylePr w:type="lastRow">
+      <w:rPr>
+        <w:b/>
+        <w:bCs/>
+      </w:rPr>
+      <w:tblPr/>
+      <w:tcPr>
+        <w:tcBorders>
+          <w:top w:val="double" w:sz="4" w:space="0" w:color="156082" w:themeColor="accent1"/>
+        </w:tcBorders>
+      </w:tcPr>
+    </w:tblStylePr>
+    <w:tblStylePr w:type="firstCol">
+      <w:rPr>
+        <w:b/>
+        <w:bCs/>
+      </w:rPr>
+    </w:tblStylePr>
+    <w:tblStylePr w:type="lastCol">
+      <w:rPr>
+        <w:b/>
+        <w:bCs/>
+      </w:rPr>
+    </w:tblStylePr>
+    <w:tblStylePr w:type="band1Vert">
+      <w:tblPr/>
+      <w:tcPr>
+        <w:shd w:val="clear" w:color="auto" w:fill="C1E4F5" w:themeFill="accent1" w:themeFillTint="33"/>
+      </w:tcPr>
+    </w:tblStylePr>
+    <w:tblStylePr w:type="band1Horz">
+      <w:tblPr/>
+      <w:tcPr>
+        <w:shd w:val="clear" w:color="auto" w:fill="C1E4F5" w:themeFill="accent1" w:themeFillTint="33"/>
+      </w:tcPr>
+    </w:tblStylePr>
+  </w:style>
+  <w:style w:type="paragraph" w:customStyle="1" w:styleId="lbjegyzet">
+    <w:name w:val="lábjegyzet"/>
+    <w:basedOn w:val="Norml"/>
+    <w:link w:val="lbjegyzetChar"/>
+    <w:qFormat/>
+    <w:rsid w:val="00B55954"/>
+    <w:pPr>
+      <w:spacing w:after="240"/>
+    </w:pPr>
+    <w:rPr>
+      <w:rFonts w:cs="Times New Roman"/>
+      <w:sz w:val="20"/>
+      <w:szCs w:val="24"/>
+    </w:rPr>
+  </w:style>
+  <w:style w:type="character" w:customStyle="1" w:styleId="lbjegyzetChar">
+    <w:name w:val="lábjegyzet Char"/>
+    <w:basedOn w:val="Bekezdsalapbettpusa"/>
+    <w:link w:val="lbjegyzet"/>
+    <w:rsid w:val="00B55954"/>
+    <w:rPr>
+      <w:rFonts w:ascii="Times New Roman" w:hAnsi="Times New Roman" w:cs="Times New Roman"/>
+      <w:sz w:val="20"/>
+      <w:szCs w:val="24"/>
+    </w:rPr>
   </w:style>
 </w:styles>
 </file>

</xml_diff>